<commit_message>
Rebuild the tracker docx from the current markdown
Co-Authored-By: Claude Opus 5 <noreply@anthropic.com>
Claude-Session: https://claude.ai/code/session_01W9UtE7X76spacWeSvBH7tv
</commit_message>
<xml_diff>
--- a/research/MASTER_TRACKER.docx
+++ b/research/MASTER_TRACKER.docx
@@ -32637,6 +32637,213 @@
       </w:r>
       <w:r>
         <w:t xml:space="preserve">: two defects shipped and were caught only by reading production afterwards, the gate-stats guard that never fired because its column was not selected and the access.html head that was deleted by a slicing script. Both passed syntax checks and content greps. The rule that follows is that a deploy is not evidence, and any change to a file's structure needs a structural assertion rather than a check that the words are still there.</w:t>
+      </w:r>
+    </w:p>
+    <w:p>
+      <w:pPr>
+        <w:numPr>
+          <w:ilvl w:val="0"/>
+          <w:numId w:val="1"/>
+        </w:numPr>
+        <w:spacing w:after="60"/>
+      </w:pPr>
+      <w:r>
+        <w:t xml:space="preserve">2026-08-11 (endorsements-per-day chart added to pilot-status.html): Owner asked for a visual count of endorsements per day on the public status dashboard. </w:t>
+      </w:r>
+      <w:r>
+        <w:rPr>
+          <w:b/>
+        </w:rPr>
+        <w:t xml:space="preserve">THE SERIES DID NOT EXIST AND HAD TO BE BUILT FIRST</w:t>
+      </w:r>
+      <w:r>
+        <w:t xml:space="preserve">: api/support-stats.js selected only the payload column from the source=eq.support rows, so no timestamp ever reached the client and no daily figure could be drawn. Added created_at to the select with an ascending order, and the endpoint now returns by_day plus days_span, days_with_activity, peak_day_endorsements, mean_per_active_day and a note. </w:t>
+      </w:r>
+      <w:r>
+        <w:rPr>
+          <w:b/>
+        </w:rPr>
+        <w:t xml:space="preserve">THE SERIES IS DENSE, NOT SPARSE, AND THAT IS THE POINT</w:t>
+      </w:r>
+      <w:r>
+        <w:t xml:space="preserve">: every date between the first and last endorsement is emitted with a zero where nothing happened, because a sparse series drawn as a bar chart silently closes the gaps and makes a quiet stretch look busy. 2026-08-03 has zero endorsements and now renders as an empty column instead of vanishing. No deduplication is applied and none is needed: the endorsement is a bare GET with no form behind it, so one row is one click. The existing internal-smoke-test source filter still applies, so verify, test, selftest and deploytest clicks stay out. </w:t>
+      </w:r>
+      <w:r>
+        <w:rPr>
+          <w:b/>
+        </w:rPr>
+        <w:t xml:space="preserve">CHART BUILT IN THE HOUSE PATTERN, NO LIBRARY, INLINE STYLES, DESIGN TOKENS ONLY</w:t>
+      </w:r>
+      <w:r>
+        <w:t xml:space="preserve">, matching the existing .chart and .cards blocks: four stat tiles (endorsements, best single day, days with activity, mean per active day) above a column chart in var(--ready-text) with var(--rule) for zero days, a thinned date axis that shows at most twelve labels so they cannot collide on a phone, a per-column title attribute carrying the exact date and count, and a sentence underneath stating span, active days, peak and the first and last dates. </w:t>
+      </w:r>
+      <w:r>
+        <w:rPr>
+          <w:b/>
+        </w:rPr>
+        <w:t xml:space="preserve">LIVE VALUES AT BUILD TIME: 40 endorsements over 5 days, 4 of them active, peak 28 on 2026-07-31, mean 10.0 per active day, latest 2026-08-04.</w:t>
+      </w:r>
+      <w:r>
+        <w:t xml:space="preserve"> Two defects were caught in review before deploy and fixed: the bar cells used flex 1 0 14px with no maximum, so a five-day series stretched each column to roughly 250px, capped at 46px with the identical cap applied to the axis cells so labels stay under their columns; and the loadSupport catch branch reset the other two charts but not this one, leaving it on Loading forever if the endpoint failed, so a failure state was wired. Verified at 900px and 390px: five columns rendered, titles correct, no horizontal scroll at either width. </w:t>
+      </w:r>
+      <w:r>
+        <w:rPr>
+          <w:b/>
+        </w:rPr>
+        <w:t xml:space="preserve">THE NUMBERS ALSO ANSWER A QUESTION NOT ASKED: THE ENDORSEMENT CURVE IS NOT LIVE TRAFFIC.</w:t>
+      </w:r>
+      <w:r>
+        <w:t xml:space="preserve"> The latest endorsement is 2026-08-04, a week old, with 28 of the 40 on a single day. The one-click endorsement pathway is not currently receiving clicks, which is the same finding as the empty evaluation funnel and has the same cause.</w:t>
+      </w:r>
+    </w:p>
+    <w:p>
+      <w:pPr>
+        <w:numPr>
+          <w:ilvl w:val="0"/>
+          <w:numId w:val="1"/>
+        </w:numPr>
+        <w:spacing w:after="60"/>
+      </w:pPr>
+      <w:r>
+        <w:t xml:space="preserve">2026-08-11 (the one-click endorsement was recording NOTHING and is now fixed and verified end to end): Owner asked to confirm the one-click endorsement is active. </w:t>
+      </w:r>
+      <w:r>
+        <w:rPr>
+          <w:b/>
+        </w:rPr>
+        <w:t xml:space="preserve">IT WAS NOT. NOTHING HAD RECORDED AN ENDORSEMENT SINCE 03:45 TODAY, AND I BROKE IT.</w:t>
+      </w:r>
+      <w:r>
+        <w:t xml:space="preserve"> api/support.js stopped writing on 2026-08-02 and handed the write to the registration form, which api/access performed on submit. Replacing the campaign gate with a single evaluation CTA earlier today removed that form, and with it the only thing writing the row. Between those two changes every click 302'd to a screen reading "Your support is recorded" and recorded nothing. The last genuine endorsement is dated 2026-08-04T09:03Z. </w:t>
+      </w:r>
+      <w:r>
+        <w:rPr>
+          <w:b/>
+        </w:rPr>
+        <w:t xml:space="preserve">THE PRECEDING TURN'S CHART MADE THIS VISIBLE AND I DID NOT READ IT AS A DEFECT</w:t>
+      </w:r>
+      <w:r>
+        <w:t xml:space="preserve">: the daily series showed the latest endorsement a week old with a flat tail, which was reported as "the pathway is not currently receiving clicks" when the correct reading was that the pathway was not currently recording them. The data was on screen and the wrong conclusion was drawn from it. </w:t>
+      </w:r>
+      <w:r>
+        <w:rPr>
+          <w:b/>
+        </w:rPr>
+        <w:t xml:space="preserve">FIX</w:t>
+      </w:r>
+      <w:r>
+        <w:t xml:space="preserve">: the write is back on the bare GET in api/support.js, with the same payload shape as the pre-2026-08-02 rows so the daily series and country breakdown stay one continuous history rather than two incompatible halves. Campaign, referral tag and the two-letter edge country only. No name, no email, no IP, no user agent, no identifier of any kind. The redirect is issued whatever the database does, so a write failure never costs the reader their click. No registered flag is set, because nobody registers here and gate-stats uses that flag to tell a registration from a click. </w:t>
+      </w:r>
+      <w:r>
+        <w:rPr>
+          <w:b/>
+        </w:rPr>
+        <w:t xml:space="preserve">VERIFIED IN FOUR STAGES AGAINST PRODUCTION</w:t>
+      </w:r>
+      <w:r>
+        <w:t xml:space="preserve">: a suppressed tag wrote nothing and the total held at 40; an unsuppressed e2echeck tag wrote a real row and the total moved to 41, proving the write path rather than assuming it; the purge helper removed that row and the total returned to 40; and the full redirect chain was walked for both campaigns across six referral tags, all twelve resolving correctly with campaign and src preserved into access.html. </w:t>
+      </w:r>
+      <w:r>
+        <w:rPr>
+          <w:b/>
+        </w:rPr>
+        <w:t xml:space="preserve">THOSE TWELVE CHAIN CHECKS WROTE TWELVE REAL ROWS AND POLLUTED THE COUNT TO 52, WHICH IS THE EXACT ERROR I HAVE BEEN GUARDING AGAINST ALL SESSION.</w:t>
+      </w:r>
+      <w:r>
+        <w:t xml:space="preserve"> They carried genuine src tags so no tag filter could reach them. Purged by an exact timestamp bracket instead, which is safe by construction here: the previous real endorsement is 2026-08-04T09:03Z, nothing was recorded in the interval because the write was broken, and all twelve landed inside a six second window. Verified back to 40 with the daily series restored to 28/2/9/0/1 and by_source back to its genuine distribution. </w:t>
+      </w:r>
+      <w:r>
+        <w:rPr>
+          <w:b/>
+        </w:rPr>
+        <w:t xml:space="preserve">STANDING ADDITION TO THE PURGE HELPER</w:t>
+      </w:r>
+      <w:r>
+        <w:t xml:space="preserve">: source=support rows tagged e2echeck are now removed automatically, so the endorsement counter can be verified in future without permanently inflating it, which was the only reason the twelve real clicks were fired in the first place. </w:t>
+      </w:r>
+      <w:r>
+        <w:rPr>
+          <w:b/>
+        </w:rPr>
+        <w:t xml:space="preserve">THE LESSON THAT GENERALISES: REMOVING A FORM REMOVES EVERYTHING THAT FORM WAS DOING.</w:t>
+      </w:r>
+      <w:r>
+        <w:t xml:space="preserve"> The gate was removed as a conversion obstacle and it was also the write path for a separate counter on a separate page. Nothing in the change touched api/support.js, so nothing in the review of that change looked at it.</w:t>
+      </w:r>
+    </w:p>
+    <w:p>
+      <w:pPr>
+        <w:numPr>
+          <w:ilvl w:val="0"/>
+          <w:numId w:val="1"/>
+        </w:numPr>
+        <w:spacing w:after="60"/>
+      </w:pPr>
+      <w:r>
+        <w:t xml:space="preserve">2026-08-11 (who was actually lost in the endorsement outage, and what was downloaded today): Owner asked whether this morning's clickers were captured and whether today's guides were downloaded. </w:t>
+      </w:r>
+      <w:r>
+        <w:rPr>
+          <w:b/>
+        </w:rPr>
+        <w:t xml:space="preserve">NOBODY WAS CAPTURED, BUT THE LOSS IS ONE PERSON, NOT EIGHTEEN.</w:t>
+      </w:r>
+      <w:r>
+        <w:t xml:space="preserve"> The endorsement write was broken, so zero endorsement rows exist for today. The clicks are recoverable from the gate-view rows access.html writes on load, which is a reliable 1:1 proxy because one /api/support click produces one page load and one row. Today shows 18 campaign gate views between 03:47 and 04:45, and </w:t>
+      </w:r>
+      <w:r>
+        <w:rPr>
+          <w:b/>
+        </w:rPr>
+        <w:t xml:space="preserve">ALL 18 CARRY A SINGLE IDENTICAL USER AGENT</w:t>
+      </w:r>
+      <w:r>
+        <w:t xml:space="preserve">: iPhone, iOS 26.5.2, Chrome for iOS 151, US, mobile. One device, 18 loads across 58 minutes, alternating between rtkw and defend, with a load at 04:29:26 matching the timestamp on the owner's own screenshot. That is a person testing their own links, not eighteen visitors, and reporting it as eighteen lost endorsements would have overstated the loss by a factor of eighteen. </w:t>
+      </w:r>
+      <w:r>
+        <w:rPr>
+          <w:b/>
+        </w:rPr>
+        <w:t xml:space="preserve">THE OUTAGE IS ALSO MUCH OLDER THAN THIS MORNING AND THAT MATTERS MORE.</w:t>
+      </w:r>
+      <w:r>
+        <w:t xml:space="preserve"> api/support stopped writing directly on 2026-08-02 and handed the write to the registration form. Since that date there have been 99 campaign gate views, meaning 99 clicks that landed on the screen, against exactly 1 endorsement row written, the registered row dated 2026-08-04. So the count has been effectively frozen for nine days, not five hours, and the 40 total is a pre-2026-08-02 figure carried forward. Removing the form this morning did not start the problem, it removed the last surviving path through it. </w:t>
+      </w:r>
+      <w:r>
+        <w:rPr>
+          <w:b/>
+        </w:rPr>
+        <w:t xml:space="preserve">NO BACKFILL WAS PERFORMED AND NONE SHOULD BE WITHOUT AN EXPLICIT DECISION</w:t>
+      </w:r>
+      <w:r>
+        <w:t xml:space="preserve">: writing 98 synthetic endorsement rows from gate-view proxies would put fabricated records into the dataset a buyer will audit, and the proxy is sound for counting but is not the same event. The gate-view rows remain available if the owner wants the reconstruction done deliberately and labelled as such. </w:t>
+      </w:r>
+      <w:r>
+        <w:rPr>
+          <w:b/>
+        </w:rPr>
+        <w:t xml:space="preserve">TODAY'S GUIDE DOWNLOADS: 7 ROWS, OF WHICH 5 WERE MINE.</w:t>
+      </w:r>
+      <w:r>
+        <w:t xml:space="preserve"> The block at 04:16:08 to 04:16:12 is exactly the five link shapes from my own gate-removal verification, one second apart, in the order the check ran, carrying international/email, employment/site, fairhousing/signature, international/footer and employment/guides. They could not be filtered by tag because the tags were the thing under test, so they were bracketed by timestamp and purged; geo-stats is back from 70 to 65. The remaining 2, employment and international at 04:11:46 and 04:11:50 with src=guides, sit inside the same iPhone session that was clicking the campaign links a minute either side, so </w:t>
+      </w:r>
+      <w:r>
+        <w:rPr>
+          <w:b/>
+        </w:rPr>
+        <w:t xml:space="preserve">NO OUTSIDE PARTY DOWNLOADED A GUIDE TODAY.</w:t>
+      </w:r>
+      <w:r>
+        <w:t xml:space="preserve"> User-agent capture on download rows shipped at 04:32, after all seven, so none of them carry a UA and the timing signature is the only evidence available; from tomorrow that separation is automatic. </w:t>
+      </w:r>
+      <w:r>
+        <w:rPr>
+          <w:b/>
+        </w:rPr>
+        <w:t xml:space="preserve">SECOND SELF-INFLICTED POLLUTION OF THE DAY, SAME ROOT CAUSE</w:t>
+      </w:r>
+      <w:r>
+        <w:t xml:space="preserve">: verification traffic fired against production with genuine-looking tags. Both were caught and purged by exact timestamp brackets, and both would have been avoided by testing against a local server instead of the live site. That is now the rule for anything that writes.</w:t>
       </w:r>
     </w:p>
     <w:sectPr>

</xml_diff>

<commit_message>
Rebuild the tracker docx
Co-Authored-By: Claude Opus 5 <noreply@anthropic.com>
Claude-Session: https://claude.ai/code/session_01W9UtE7X76spacWeSvBH7tv
</commit_message>
<xml_diff>
--- a/research/MASTER_TRACKER.docx
+++ b/research/MASTER_TRACKER.docx
@@ -32844,6 +32844,90 @@
       </w:r>
       <w:r>
         <w:t xml:space="preserve">: verification traffic fired against production with genuine-looking tags. Both were caught and purged by exact timestamp brackets, and both would have been avoided by testing against a local server instead of the live site. That is now the rule for anything that writes.</w:t>
+      </w:r>
+    </w:p>
+    <w:p>
+      <w:pPr>
+        <w:numPr>
+          <w:ilvl w:val="0"/>
+          <w:numId w:val="1"/>
+        </w:numPr>
+        <w:spacing w:after="60"/>
+      </w:pPr>
+      <w:r>
+        <w:t xml:space="preserve">2026-08-11 (pilot-status.html audited panel by panel; RR-127 completed and the auto-population handled it with no code change): Owner asked whether the links on pilot-status.html are updating. </w:t>
+      </w:r>
+      <w:r>
+        <w:rPr>
+          <w:b/>
+        </w:rPr>
+        <w:t xml:space="preserve">AUDITED ALL ELEVEN DATA SOURCES THE PAGE ACTUALLY REQUESTS, NOT THE EIGHT THAT ARE OBVIOUS</w:t>
+      </w:r>
+      <w:r>
+        <w:t xml:space="preserve">: eight /api/*-stats endpoints plus three direct anon reads of pilot_progress, realcase_progress and armb_progress. Every one returns HTTP 200 with valid JSON. Rendered the page headless against real production payloads and asserted the end state rather than eyeballing it: zero panels left on "Loading", zero JS errors from the page, and every one of the 44 stat tiles populated. The only tile showing a placeholder is op-flagged, which is correct: flagged_condition_pct is null because no org-pilot records exist. Ten values were cross-checked tile against endpoint and all ten matched, so the page is rendering current data and not a cached copy. </w:t>
+      </w:r>
+      <w:r>
+        <w:rPr>
+          <w:b/>
+        </w:rPr>
+        <w:t xml:space="preserve">A CACHING DEFECT WAS REPORTED AND THEN DISPROVED BY BETTER MEASUREMENT.</w:t>
+      </w:r>
+      <w:r>
+        <w:t xml:space="preserve"> curl -L -I showed contributor-stats and orgpilot-stats with no Cache-Control, which would have meant those two panels could serve stale. Reading the source showed both set no-store, and re-checking against www without following the redirect confirmed it: the missing header belonged to the 307, not the endpoint. Seven of nine send no-store, asset-stats sends public/max-age=0/must-revalidate which revalidates every request, and panel-stats sends max-age=60 deliberately. No staleness anywhere. </w:t>
+      </w:r>
+      <w:r>
+        <w:rPr>
+          <w:b/>
+        </w:rPr>
+        <w:t xml:space="preserve">THE HARNESS BUG FROM THE PANEL-STATS TURN REPEATED AND WAS CAUGHT THE SAME WAY</w:t>
+      </w:r>
+      <w:r>
+        <w:t xml:space="preserve">: the first audit run reported that the page requested only three sources and that every API-fed tile read zero, which would have been a serious finding. Playwright matches the last-registered route first and my catch-all was registered after the specific stubs, so it swallowed all eight API calls and returned {}. Re-ordered, all eleven appeared. Two ERR_CONNECTION_RESET entries are the Google Fonts requests, which cannot resolve in this sandbox, and are not a page defect. </w:t>
+      </w:r>
+      <w:r>
+        <w:rPr>
+          <w:b/>
+        </w:rPr>
+        <w:t xml:space="preserve">RR-127 CANDID OPRIS COMPLETED TODAY AT 18:23Z, ALL 24 READS IN ONE SITTING, VERIFIED WITH check_completion.py, EXIT 0.</w:t>
+      </w:r>
+      <w:r>
+        <w:t xml:space="preserve"> RR-117 also shows 24 today. Arm A had no activity. </w:t>
+      </w:r>
+      <w:r>
+        <w:rPr>
+          <w:b/>
+        </w:rPr>
+        <w:t xml:space="preserve">THIS IS THE FIRST PROOF THE AUTO-POPULATION WORKS IN PRODUCTION</w:t>
+      </w:r>
+      <w:r>
+        <w:t xml:space="preserve">: /api/panel-stats already returned 56 reviewers and 35 completers with no code change and no intervention, and the six public pages were rendering those live values while their markup fallbacks still read 55 and 34. That is exactly the failure the endpoint was built to prevent after the same drift went unnoticed for most of a day on 2026-08-11. RR-127 had zero reads before today, so the graded figure moves as well as the completed one. </w:t>
+      </w:r>
+      <w:r>
+        <w:rPr>
+          <w:b/>
+        </w:rPr>
+        <w:t xml:space="preserve">THE WARNING BRANCH ADDED TO build_expert_roster.py THIS MORNING FIRED CORRECTLY AND UNPROMPTED</w:t>
+      </w:r>
+      <w:r>
+        <w:t xml:space="preserve">: 35 live completers against 34 transcribed entries, naming the drift instead of silently reporting the roster length as it used to. Added RR-127 (Founder and Managing Partner, Opris &amp; Associates; AI and data governance and digital trust; Canada, Greater Toronto Area; B2). </w:t>
+      </w:r>
+      <w:r>
+        <w:rPr>
+          <w:b/>
+        </w:rPr>
+        <w:t xml:space="preserve">COUNTRIES STAY AT 16 AND THIS WAS RECOMPUTED, NOT ASSUMED</w:t>
+      </w:r>
+      <w:r>
+        <w:t xml:space="preserve">: Candid Opris is Canada, which rises from 3 to 4 completers but was already represented. Continents stay 5. Published figures are now 56 reviewers, 35 completers, 16 countries, 5 continents, and the markup fallbacks on all six pages were refreshed so a fetch failure cannot fall back to a stale number. </w:t>
+      </w:r>
+      <w:r>
+        <w:rPr>
+          <w:b/>
+        </w:rPr>
+        <w:t xml:space="preserve">RECOGNITION FOR RR-127 IS NOT ISSUED AND IS OWNER-SIDE</w:t>
+      </w:r>
+      <w:r>
+        <w:t xml:space="preserve">: the completion is verified, but the certificate, message and recommendation were not requested and the Arm B blind still holds while RR-108 is unfinished.</w:t>
       </w:r>
     </w:p>
     <w:sectPr>

</xml_diff>

<commit_message>
Record the funnel zero verification and the mobile overflow fix
Co-Authored-By: Claude Opus 5 <noreply@anthropic.com>
Claude-Session: https://claude.ai/code/session_01W9UtE7X76spacWeSvBH7tv
</commit_message>
<xml_diff>
--- a/research/MASTER_TRACKER.docx
+++ b/research/MASTER_TRACKER.docx
@@ -32928,6 +32928,54 @@
       </w:r>
       <w:r>
         <w:t xml:space="preserve">: the completion is verified, but the certificate, message and recommendation were not requested and the Arm B blind still holds while RR-108 is unfinished.</w:t>
+      </w:r>
+    </w:p>
+    <w:p>
+      <w:pPr>
+        <w:numPr>
+          <w:ilvl w:val="0"/>
+          <w:numId w:val="1"/>
+        </w:numPr>
+        <w:spacing w:after="60"/>
+      </w:pPr>
+      <w:r>
+        <w:t xml:space="preserve">2026-08-11 (the evaluation funnel zeros are real, and the phone screenshot was showing a page-level horizontal scroll): Owner sent a phone screenshot of the Reviewer Evaluation Funnel reading zero across all five tiles and asked why it is blank. </w:t>
+      </w:r>
+      <w:r>
+        <w:rPr>
+          <w:b/>
+        </w:rPr>
+        <w:t xml:space="preserve">TWO SEPARATE THINGS, ONE REAL DEFECT AND ONE CORRECT NUMBER.</w:t>
+      </w:r>
+      <w:r>
+        <w:t xml:space="preserve"> The defect is visual and had nothing to do with the funnel: the screenshot shows every heading clipped at the left edge, which is the whole page scrolled sideways. Measured at 390x844 with mobile emulation, documentElement.scrollWidth was 400 against a 390 viewport. Cause is the three data tables, whose columns cannot fit a phone. Wrapped each in a .tablewrap container with overflow-x auto so the TABLE scrolls and the DOCUMENT does not; scrollWidth is now 390 and the page-level overflow is gone. The tables still measure 400 internally, which is correct, they now scroll within their own box. </w:t>
+      </w:r>
+      <w:r>
+        <w:rPr>
+          <w:b/>
+        </w:rPr>
+        <w:t xml:space="preserve">THE ZEROS ARE A TRUE ZERO AND THAT WAS PROVED RATHER THAN ASSUMED, BECAUSE THIS MORNING A COUNTER READING ZERO TURNED OUT TO BE BROKEN.</w:t>
+      </w:r>
+      <w:r>
+        <w:t xml:space="preserve"> Fired a real GET at the live instrument with an unsuppressed e2echeck tag: the row was written to interaction_events as source eval-view carrying src, country, user agent and device. </w:t>
+      </w:r>
+      <w:r>
+        <w:rPr>
+          <w:b/>
+        </w:rPr>
+        <w:t xml:space="preserve">MY FIRST READING OF THAT TEST WAS WRONG AND THE ENDPOINT'S OWN ACCOUNTING FIELD CORRECTED IT.</w:t>
+      </w:r>
+      <w:r>
+        <w:t xml:space="preserve"> asset-stats still reported opened 0, which I initially recorded as the counter being broken. It was not: the request came from curl/8.5.0, and the crawler filter added earlier today matches curl, so the row was written and then correctly excluded. opened_crawlers_excluded read 1, which is exactly the field added so an exclusion could never be silent, and it is the reason the wrong conclusion survived less than a minute. Purged the check row; opened and opened_crawlers_excluded are both back to 0. </w:t>
+      </w:r>
+      <w:r>
+        <w:rPr>
+          <w:b/>
+        </w:rPr>
+        <w:t xml:space="preserve">CONCLUSION: THE WRITE PATH WORKS, THE FILTER WORKS, AND NOBODY HAS OPENED THE EVALUATION.</w:t>
+      </w:r>
+      <w:r>
+        <w:t xml:space="preserve"> The panel is not blank and not broken. The note already on the page states it accurately: the instrument opened on 9 August and the open counter on 10 August, so a zero is the expected state rather than a measured result. It has never been sent to anyone, which remains the single highest-value owner action.</w:t>
       </w:r>
     </w:p>
     <w:sectPr>

</xml_diff>

<commit_message>
Record the research/ isolation re-check
The stop-hook file is committed. A grep for "^research" on main matched
research.html and research-data.html, two public root pages, not the private
directory: 0 files under research/ on main against 325 on the dev branch, and
the tracker, the completion checker and the blind answer key all return 404 in
production.

Co-Authored-By: Claude Opus 5 <noreply@anthropic.com>
Claude-Session: https://claude.ai/code/session_01W9UtE7X76spacWeSvBH7tv
</commit_message>
<xml_diff>
--- a/research/MASTER_TRACKER.docx
+++ b/research/MASTER_TRACKER.docx
@@ -32976,6 +32976,36 @@
       </w:r>
       <w:r>
         <w:t xml:space="preserve"> The panel is not blank and not broken. The note already on the page states it accurately: the instrument opened on 9 August and the open counter on 10 August, so a zero is the expected state rather than a measured result. It has never been sent to anyone, which remains the single highest-value owner action.</w:t>
+      </w:r>
+    </w:p>
+    <w:p>
+      <w:pPr>
+        <w:numPr>
+          <w:ilvl w:val="0"/>
+          <w:numId w:val="1"/>
+        </w:numPr>
+        <w:spacing w:after="60"/>
+      </w:pPr>
+      <w:r>
+        <w:t xml:space="preserve">2026-08-11 (working tree cleared; research/ isolation re-confirmed after a false positive in my own check): Stop hook flagged an untracked file. It was research/shot_funnel_phone.png, the 390px screenshot evidencing the tablewrap overflow fix. Committed and pushed; working tree clean, branch level with origin. </w:t>
+      </w:r>
+      <w:r>
+        <w:rPr>
+          <w:b/>
+        </w:rPr>
+        <w:t xml:space="preserve">A LEAK WAS THEN REPORTED BY MY OWN CHECK AND DISPROVED.</w:t>
+      </w:r>
+      <w:r>
+        <w:t xml:space="preserve"> git ls-tree origin/main piped through grep "^research" returned 2, which read as private research files sitting on the production branch. They are research.html and research-data.html, two public pages at the repository root whose names begin with the same string. Re-ran scoped to the directory: 0 files under research/ on main, against 325 on the dev branch. Confirmed independently against production, where /research/MASTER_TRACKER.md, /research/check_completion.py and /research/Blind_Recheck_KEY_E08.md all return 404. The selective-deploy pattern is holding and the blind-study answer key has never been publicly reachable. </w:t>
+      </w:r>
+      <w:r>
+        <w:rPr>
+          <w:b/>
+        </w:rPr>
+        <w:t xml:space="preserve">THE GREP WAS THE BUG, NOT THE DEPLOY</w:t>
+      </w:r>
+      <w:r>
+        <w:t xml:space="preserve">, and it is the third time today that a check written loosely produced a wrong finding that better measurement reversed: the cache-control header that belonged to a redirect, the evaluation counter that was filtered rather than broken, and now a directory prefix matched as a substring. Each was caught within a minute because the follow-up measurement was scoped tighter than the first.</w:t>
       </w:r>
     </w:p>
     <w:sectPr>

</xml_diff>

<commit_message>
Record the arrival-logging gap and its fix
Co-Authored-By: Claude Opus 5 <noreply@anthropic.com>
Claude-Session: https://claude.ai/code/session_01W9UtE7X76spacWeSvBH7tv
</commit_message>
<xml_diff>
--- a/research/MASTER_TRACKER.docx
+++ b/research/MASTER_TRACKER.docx
@@ -33006,6 +33006,54 @@
       </w:r>
       <w:r>
         <w:t xml:space="preserve">, and it is the third time today that a check written loosely produced a wrong finding that better measurement reversed: the cache-control header that belonged to a redirect, the evaluation counter that was filtered rather than broken, and now a directory prefix matched as a substring. Each was caught within a minute because the follow-up measurement was scoped tighter than the first.</w:t>
+      </w:r>
+    </w:p>
+    <w:p>
+      <w:pPr>
+        <w:numPr>
+          <w:ilvl w:val="0"/>
+          <w:numId w:val="1"/>
+        </w:numPr>
+        <w:spacing w:after="60"/>
+      </w:pPr>
+      <w:r>
+        <w:t xml:space="preserve">2026-08-11 (why clicks were showing up nowhere: three of four entry points recorded no arrival at all): Owner asked why people clicking to support a campaign or reach the evaluation or training produce nothing on the dashboard. </w:t>
+      </w:r>
+      <w:r>
+        <w:rPr>
+          <w:b/>
+        </w:rPr>
+        <w:t xml:space="preserve">HIS PERCEPTION WAS CORRECT AND THE CAUSE IS STRUCTURAL, NOT A DISPLAY PROBLEM.</w:t>
+      </w:r>
+      <w:r>
+        <w:t xml:space="preserve"> Audited every entry point for whether it logs an ARRIVAL or only a completed ACTION. Result: reviewer/index.html made no logging call whatsoever, only a read of panel-stats, so every click on the reviewer landing page was invisible. training.html recorded only a completed enrolment, so a reader who clicked the training link, opened Module 1 in preview mode and left produced no row anywhere; the 7 enrolments are the only evidence that page has ever generated. reviewer/completion.html makes no API call at all. And the endorsement write was broken from 2026-08-02 until this morning, already fixed. Only three surfaces were logging arrivals: access.html via gate-view, the evaluation via eval-view added 2026-08-10, and downloads via /api/dl. </w:t>
+      </w:r>
+      <w:r>
+        <w:rPr>
+          <w:b/>
+        </w:rPr>
+        <w:t xml:space="preserve">SO OF THE FOUR THINGS HE WAS WATCHING, THREE COULD NOT HAVE SHOWN ANYTHING NO MATTER HOW MANY PEOPLE CLICKED.</w:t>
+      </w:r>
+      <w:r>
+        <w:t xml:space="preserve"> Fixed by adding a one-per-session arrival ping to reviewer/index.html and training.html carrying referral tag, country and user agent, with deploy checks and owner previews suppressed at the client. Written under new source values reviewer-view and train-view rather than gate-view, so gate-stats, which treats gate-view as a campaign form open, is untouched by the change. asset-stats publishes both under a new entry_points block with crawler exclusions shown separately. </w:t>
+      </w:r>
+      <w:r>
+        <w:rPr>
+          <w:b/>
+        </w:rPr>
+        <w:t xml:space="preserve">THE BLOCK STATES THAT ARRIVALS BEFORE 2026-08-11 ARE UNKNOWN RATHER THAN ZERO</w:t>
+      </w:r>
+      <w:r>
+        <w:t xml:space="preserve">, which is the honest form: there is no basis for claiming nobody visited, only for saying nobody counted. Verified both counters end to end against production with an unsuppressed tag and a real browser user agent: reviewer_landing_views and training_page_views each moved to 1, then purged back to 0 through the purge helper, which now covers both sources. </w:t>
+      </w:r>
+      <w:r>
+        <w:rPr>
+          <w:b/>
+        </w:rPr>
+        <w:t xml:space="preserve">THIS IS THE SAME CLASS OF FAULT AS THE ENDORSEMENT OUTAGE FOUND EARLIER TODAY AND THE SECOND INSTANCE IN ONE DAY</w:t>
+      </w:r>
+      <w:r>
+        <w:t xml:space="preserve">: a counter reading zero because nothing writes to it, not because nothing happened. The pattern to check for is a page that reads an endpoint but never posts to one.</w:t>
       </w:r>
     </w:p>
     <w:sectPr>

</xml_diff>

<commit_message>
Record the Today panel and the two passes that missed the actual complaint
Co-Authored-By: Claude Opus 5 <noreply@anthropic.com>
Claude-Session: https://claude.ai/code/session_01W9UtE7X76spacWeSvBH7tv
</commit_message>
<xml_diff>
--- a/research/MASTER_TRACKER.docx
+++ b/research/MASTER_TRACKER.docx
@@ -33054,6 +33054,63 @@
       </w:r>
       <w:r>
         <w:t xml:space="preserve">: a counter reading zero because nothing writes to it, not because nothing happened. The pattern to check for is a page that reads an endpoint but never posts to one.</w:t>
+      </w:r>
+    </w:p>
+    <w:p>
+      <w:pPr>
+        <w:numPr>
+          <w:ilvl w:val="0"/>
+          <w:numId w:val="1"/>
+        </w:numPr>
+        <w:spacing w:after="60"/>
+      </w:pPr>
+      <w:r>
+        <w:t xml:space="preserve">2026-08-11 (the page had no arrival counters for TODAY; Today panel built and live): Owner reported for the third time that no link on pilot-status.html updates today's numbers. </w:t>
+      </w:r>
+      <w:r>
+        <w:rPr>
+          <w:b/>
+        </w:rPr>
+        <w:t xml:space="preserve">HE WAS RIGHT EVERY TIME AND MY PREVIOUS TWO ANSWERS ADDRESSED ADJACENT PROBLEMS INSTEAD OF THIS ONE.</w:t>
+      </w:r>
+      <w:r>
+        <w:t xml:space="preserve"> The first pass verified that all eleven data sources return 200 and every tile populates, which was true and did not answer the question. The second pass found and fixed the missing arrival logging on the reviewer landing and training pages, which was a real defect and still did not answer it. </w:t>
+      </w:r>
+      <w:r>
+        <w:rPr>
+          <w:b/>
+        </w:rPr>
+        <w:t xml:space="preserve">THE ACTUAL FAULT: EVERY "TODAY" TILE ON THE PAGE COUNTED A COMPLETED ACTION, NEVER AN ARRIVAL.</w:t>
+      </w:r>
+      <w:r>
+        <w:t xml:space="preserve"> today, rc-today, op-today, rg-today, gt-today, cb-today and tr-today count registrations, enrolments, confirmations and org pilots. None of them counts somebody arriving. So a day could carry real traffic on every link and every one of those tiles would still read zero, which is exactly what he was seeing. The date arithmetic was never wrong: gate-stats and access-stats both compute startOfTodayUTC correctly, verified against the current UTC clock. </w:t>
+      </w:r>
+      <w:r>
+        <w:rPr>
+          <w:b/>
+        </w:rPr>
+        <w:t xml:space="preserve">TODAY'S REAL ACTIVITY, WHICH THE PAGE WAS SHOWING NOWHERE: 23 human campaign-screen arrivals, 2 guide downloads and 48 records reviewed</w:t>
+      </w:r>
+      <w:r>
+        <w:t xml:space="preserve"> (RR-117 and RR-127, 24 each, both Arm B). 2 crawler rows excluded. Built a Today block in asset-stats covering campaign-screen arrivals, reviewer landing arrivals, training page arrivals, endorsements, evaluation opens, evaluation submissions, guide downloads, other downloads and records reviewed split by study, with crawlers removed and counted separately, and added an eight-tile Today panel at the TOP of pilot-status.html wired into refresh(). Verified live: the endpoint and the rendered panel agree exactly at 23 / 0 / 0 / 0 / 0 / 0 / 2 / 48. </w:t>
+      </w:r>
+      <w:r>
+        <w:rPr>
+          <w:b/>
+        </w:rPr>
+        <w:t xml:space="preserve">THE PANEL STATES PER-SURFACE START DATES BECAUSE A ZERO IS ONLY A REAL ZERO FROM THE DATE THAT SURFACE BEGAN LOGGING</w:t>
+      </w:r>
+      <w:r>
+        <w:t xml:space="preserve">: campaign screen 2026-08-02, evaluation 2026-08-10, reviewer landing and training page 2026-08-11. Endorsements read 0 today because the write was broken until 08:30 this morning and nobody has clicked since it was fixed. </w:t>
+      </w:r>
+      <w:r>
+        <w:rPr>
+          <w:b/>
+        </w:rPr>
+        <w:t xml:space="preserve">PROCESS NOTE THAT MATTERS MORE THAN THE FIX: THE COMPLAINT WAS SPECIFIC AND I ANSWERED A DIFFERENT QUESTION TWICE.</w:t>
+      </w:r>
+      <w:r>
+        <w:t xml:space="preserve"> "Nothing shows up when links are clicked" is a statement about arrivals. Both earlier passes checked whether the plumbing worked rather than whether the thing he was watching existed on the page at all.</w:t>
       </w:r>
     </w:p>
     <w:sectPr>

</xml_diff>

<commit_message>
Add the master system audit and trademark evidence dossier
Records what was changed, what the current figures are, and what is not
established by repository evidence. Baseline values are held in a separate
column from current operational values throughout.

Co-Authored-By: Claude Opus 5 <noreply@anthropic.com>
Claude-Session: https://claude.ai/code/session_01W9UtE7X76spacWeSvBH7tv
</commit_message>
<xml_diff>
--- a/research/MASTER_TRACKER.docx
+++ b/research/MASTER_TRACKER.docx
@@ -33111,6 +33111,90 @@
       </w:r>
       <w:r>
         <w:t xml:space="preserve"> "Nothing shows up when links are clicked" is a statement about arrivals. Both earlier passes checked whether the plumbing worked rather than whether the thing he was watching existed on the page at all.</w:t>
+      </w:r>
+    </w:p>
+    <w:p>
+      <w:pPr>
+        <w:numPr>
+          <w:ilvl w:val="0"/>
+          <w:numId w:val="1"/>
+        </w:numPr>
+        <w:spacing w:after="60"/>
+      </w:pPr>
+      <w:r>
+        <w:t xml:space="preserve">2026-08-11 (endorsement zero explained with evidence; last-seen date and outage cost now published; audit and trademark dossier written): Owner escalated that every counter reads zero and demanded to know where the incoming endorsements are. </w:t>
+      </w:r>
+      <w:r>
+        <w:rPr>
+          <w:b/>
+        </w:rPr>
+        <w:t xml:space="preserve">THE COUNTER IS CORRECT AND THE ANSWER IS THAT NONE HAVE COME IN.</w:t>
+      </w:r>
+      <w:r>
+        <w:t xml:space="preserve"> Last recorded endorsement is 2026-08-04, seven days ago. All 18 campaign arrivals today fall between 03:47Z and 04:45Z, which is inside the window where the write was broken, and there have been ZERO campaign arrivals since the fix deployed at 08:30Z. So today's zero is not a lost signal, it is an absence of clicks after the repair. </w:t>
+      </w:r>
+      <w:r>
+        <w:rPr>
+          <w:b/>
+        </w:rPr>
+        <w:t xml:space="preserve">THE 18 ARRIVALS ARE ONE DEVICE, NOT 18 PEOPLE</w:t>
+      </w:r>
+      <w:r>
+        <w:t xml:space="preserve">, single identical user agent, iPhone iOS 26.5.2 Chrome for iOS, 18 loads across 58 minutes alternating between both campaigns. Reporting them as 18 lost supporters would have overstated by a factor of 18. </w:t>
+      </w:r>
+      <w:r>
+        <w:rPr>
+          <w:b/>
+        </w:rPr>
+        <w:t xml:space="preserve">THE OUTAGE WAS BRACKETED PRECISELY RATHER THAN BLAMED WHOLESALE.</w:t>
+      </w:r>
+      <w:r>
+        <w:t xml:space="preserve"> Two windows, and only one is a loss. Window A, 2026-08-02 18:20Z to 2026-08-11 03:45Z: 81 campaign arrivals, but the registration form still existed, so a reader saw a form and chose not to complete it; that is a conversion failure, not a lost endorsement, and it is excluded. Window B, 03:45Z to 08:30Z today: the form was gone and the screen said "Your support is recorded" while nothing was written; 18 clicks, 1 device, and those are genuinely lost. </w:t>
+      </w:r>
+      <w:r>
+        <w:rPr>
+          <w:b/>
+        </w:rPr>
+        <w:t xml:space="preserve">NO SYNTHETIC ENDORSEMENT ROWS WERE WRITTEN.</w:t>
+      </w:r>
+      <w:r>
+        <w:t xml:space="preserve"> The lost clicks are counted live from the arrival log and published in their own field, because a derived figure and a recorded one must not share a column in a dataset a buyer audits. Added to api/support-stats: last_endorsement_at, days_since_last_endorsement and an outage block with window, clicks_not_recorded and distinct_devices. The endorsement panel now states when the last one arrived, coloured amber past three days, and discloses the outage in stop-text. Verified live: 40 total, last 2026-08-04, 7 days since, 18 clicks not recorded from 1 device. </w:t>
+      </w:r>
+      <w:r>
+        <w:rPr>
+          <w:b/>
+        </w:rPr>
+        <w:t xml:space="preserve">THE RESTORATION DATASET WAS NOT INJECTED AND THE REASON IS RECORDED IN THE DOSSIER</w:t>
+      </w:r>
+      <w:r>
+        <w:t xml:space="preserve">: PST Pilot Study, 20 cases, 84.2 percent and the 15 percent drift figure have zero occurrences anywhere in the repository or database, and the measured inter-rater value is Gwet's AC1 0.739 with 95 percent CI 0.402 to 1.000 on 10 records and 36 labels. Baseline was treated as immutable reference, current operational values preserved unchanged: 510 detection reads, 16 of 27 started, 465 comparison reads, 56 reviewers, 35 completers. </w:t>
+      </w:r>
+      <w:r>
+        <w:rPr>
+          <w:b/>
+        </w:rPr>
+        <w:t xml:space="preserve">WROTE MASTER_SYSTEM_AUDIT_AND_TRADEMARK_DOSSIER.md</w:t>
+      </w:r>
+      <w:r>
+        <w:t xml:space="preserve"> covering execution summary, metric reconciliation with baseline and current held in separate columns, today's exact figures with per-surface logging start dates, suppressed cohorts, and repository-evidence dossiers for JUSTIFICATION REVIEW STANDARD and DECISION RECONSTRUCTION RISK. </w:t>
+      </w:r>
+      <w:r>
+        <w:rPr>
+          <w:b/>
+        </w:rPr>
+        <w:t xml:space="preserve">TRADEMARK DATES ARE STATED AS WHAT THEY ARE AND NOT INFLATED</w:t>
+      </w:r>
+      <w:r>
+        <w:t xml:space="preserve">: earliest repository appearance is 2026-04-14 for JRS and 2026-06-23 for DRR, but a commit is internal drafting and not public use; earliest appearance on the production branch is 2026-07-07 for both, and that is a FLOOR rather than a first public date because 40e6cdd is a 110-file bulk import that begins that branch's history. First use anywhere and first use in commerce are both marked NOT ESTABLISHED BY REPOSITORY EVIDENCE, and a search for price, purchase, invoice, subscription and licence fee found nothing establishing a sale. </w:t>
+      </w:r>
+      <w:r>
+        <w:rPr>
+          <w:b/>
+        </w:rPr>
+        <w:t xml:space="preserve">NO USPTO ACCEPTABILITY WAS CLAIMED</w:t>
+      </w:r>
+      <w:r>
+        <w:t xml:space="preserve"> because no verified read of the ID Manual was performed; the three candidate identifications are recorded verbatim and marked unverified, with one substantive issue flagged for the attorney, that both Class 042 descriptions claim non-downloadable software and platform services while the only interactive surface, org-pilot.html, has 0 sessions all-time.</w:t>
       </w:r>
     </w:p>
     <w:sectPr>

</xml_diff>

<commit_message>
Record the one-click proof and the non-browser suppression
Co-Authored-By: Claude Opus 5 <noreply@anthropic.com>
Claude-Session: https://claude.ai/code/session_01W9UtE7X76spacWeSvBH7tv
</commit_message>
<xml_diff>
--- a/research/MASTER_TRACKER.docx
+++ b/research/MASTER_TRACKER.docx
@@ -33195,6 +33195,72 @@
       </w:r>
       <w:r>
         <w:t xml:space="preserve"> because no verified read of the ID Manual was performed; the three candidate identifications are recorded verbatim and marked unverified, with one substantive issue flagged for the attorney, that both Class 042 descriptions claim non-downloadable software and platform services while the only interactive surface, org-pilot.html, has 0 sessions all-time.</w:t>
+      </w:r>
+    </w:p>
+    <w:p>
+      <w:pPr>
+        <w:numPr>
+          <w:ilvl w:val="0"/>
+          <w:numId w:val="1"/>
+        </w:numPr>
+        <w:spacing w:after="60"/>
+      </w:pPr>
+      <w:r>
+        <w:t xml:space="preserve">2026-08-11 (proved a single click registers immediately, and stopped non-browser agents inflating the count): Owner insisted that with no gate in front of endorsements, one click should show. </w:t>
+      </w:r>
+      <w:r>
+        <w:rPr>
+          <w:b/>
+        </w:rPr>
+        <w:t xml:space="preserve">TESTED IT LIVE AND HE IS RIGHT, AND IT DOES.</w:t>
+      </w:r>
+      <w:r>
+        <w:t xml:space="preserve"> First checked whether Vercel was serving the redirect from edge cache without executing the function, which would have written nothing: x-vercel-cache reads MISS on every request, so the function runs every time. </w:t>
+      </w:r>
+      <w:r>
+        <w:rPr>
+          <w:b/>
+        </w:rPr>
+        <w:t xml:space="preserve">THOSE THREE HEADER CHECKS EACH WROTE A REAL ENDORSEMENT</w:t>
+      </w:r>
+      <w:r>
+        <w:t xml:space="preserve">, total moved 40 to 43 and last_endorsement_at moved to today, which is itself the proof the write path is live. </w:t>
+      </w:r>
+      <w:r>
+        <w:rPr>
+          <w:b/>
+        </w:rPr>
+        <w:t xml:space="preserve">FOURTH SELF-INFLICTED POLLUTION OF THE DAY, SO THE CAUSE WAS FIXED RATHER THAN THE SYMPTOM PURGED AGAIN.</w:t>
+      </w:r>
+      <w:r>
+        <w:t xml:space="preserve"> api/support.js now refuses to record an endorsement when the user agent is absent or matches a non-browser agent: googlebot, bingbot, baiduspider, yandexbot, duckduckbot, applebot, facebookexternalhit, generic bot/spider/crawl, curl, wget, python-requests, libwww, okhttp, java and go-http. The redirect still happens for everyone, so a crawler still reaches the page and simply is not counted as a supporter. This also closes a real exposure: a crawler following the campaign link from an indexed page would have inflated the supporter count and nobody would have noticed. </w:t>
+      </w:r>
+      <w:r>
+        <w:rPr>
+          <w:b/>
+        </w:rPr>
+        <w:t xml:space="preserve">DEMONSTRATED BOTH HALVES SIDE BY SIDE ON PRODUCTION</w:t>
+      </w:r>
+      <w:r>
+        <w:t xml:space="preserve">: a curl click left the total at 40, and the same URL with a real iPhone Safari user agent moved it to 41 with last_endorsement_at 2026-08-11, by_day showing 1 for today, and the Today panel reading endorsements 1 within seconds. One click shows. </w:t>
+      </w:r>
+      <w:r>
+        <w:rPr>
+          <w:b/>
+        </w:rPr>
+        <w:t xml:space="preserve">THE PURGE HELPER FAILED THREE TIMES ON THAT DEMONSTRATION ROW AND THE FALLBACK MATTERED.</w:t>
+      </w:r>
+      <w:r>
+        <w:t xml:space="preserve"> The PostgREST filter was verified correct by reading with it, x-vercel-cache read MISS so the function was executing, and the code was confirmed present on main, yet the row survived every trigger. Rather than keep retrying a mechanism that was not working, removed it with a direct SQL DELETE through the Supabase MCP connection, bracketed to the same twelve-second window, which returned the single row it deleted. Verified after: total back to 40, last_endorsement_at back to 2026-08-04 at 7 days ago, today's endorsements back to 0, Today panel 0. </w:t>
+      </w:r>
+      <w:r>
+        <w:rPr>
+          <w:b/>
+        </w:rPr>
+        <w:t xml:space="preserve">THE DATASET IS CLEAN AND THE COUNTER IS PROVEN.</w:t>
+      </w:r>
+      <w:r>
+        <w:t xml:space="preserve"> The reason today reads zero is that no third party has clicked a campaign link since the write was repaired at 08:30Z. The next genuine click will appear on the Today panel and move last_endorsement_at to the current date within seconds of landing.</w:t>
       </w:r>
     </w:p>
     <w:sectPr>

</xml_diff>

<commit_message>
Record the second endorsement gap and the four-path verification
Co-Authored-By: Claude Opus 5 <noreply@anthropic.com>
Claude-Session: https://claude.ai/code/session_01W9UtE7X76spacWeSvBH7tv
</commit_message>
<xml_diff>
--- a/research/MASTER_TRACKER.docx
+++ b/research/MASTER_TRACKER.docx
@@ -33261,6 +33261,72 @@
       </w:r>
       <w:r>
         <w:t xml:space="preserve"> The reason today reads zero is that no third party has clicked a campaign link since the write was repaired at 08:30Z. The next genuine click will appear on the Today panel and move last_endorsement_at to the current date within seconds of landing.</w:t>
+      </w:r>
+    </w:p>
+    <w:p>
+      <w:pPr>
+        <w:numPr>
+          <w:ilvl w:val="0"/>
+          <w:numId w:val="1"/>
+        </w:numPr>
+        <w:spacing w:after="60"/>
+      </w:pPr>
+      <w:r>
+        <w:t xml:space="preserve">2026-08-11 (will it work tomorrow: yes, and a second gap was found and closed first): Owner asked whether an endorsement will register tomorrow, and said two people told him they visited the page today. </w:t>
+      </w:r>
+      <w:r>
+        <w:rPr>
+          <w:b/>
+        </w:rPr>
+        <w:t xml:space="preserve">THE TWO VISITS PRODUCED NO ROW, AND THE DATA SAYS WHY.</w:t>
+      </w:r>
+      <w:r>
+        <w:t xml:space="preserve"> Grouped every gate-view row for today by user agent through the Supabase connection: all 23 carry ONE identical user agent, iPhone iOS 26.5.2 Chrome for iOS, split 14 rtkw, 4 defend, 5 with no campaign, spanning 03:47Z to 04:45Z. One device. If two other people reached the screen, nothing recorded them, and the endorsement write was in any case dead until 08:30Z. </w:t>
+      </w:r>
+      <w:r>
+        <w:rPr>
+          <w:b/>
+        </w:rPr>
+        <w:t xml:space="preserve">A SECOND GAP WAS FOUND WHILE ANSWERING THE FORWARD QUESTION AND IT WOULD HAVE PERSISTED INTO TOMORROW.</w:t>
+      </w:r>
+      <w:r>
+        <w:t xml:space="preserve"> The server-side write in /api/support only fires for readers who pass through /api/support. A reader arriving with a copied address-bar URL, a forwarded link, a bookmark, or a link a platform expanded lands directly on access.html, sees "Your support is recorded", and was recorded nowhere. That is the same false statement the outage produced, reached from a different direction, and it is the most likely explanation for a person who says they visited while the count did not move. </w:t>
+      </w:r>
+      <w:r>
+        <w:rPr>
+          <w:b/>
+        </w:rPr>
+        <w:t xml:space="preserve">CLOSED WITH A MARKER RATHER THAN A SECOND BLIND WRITE</w:t>
+      </w:r>
+      <w:r>
+        <w:t xml:space="preserve">: /api/support now appends r=1 to its redirect only when it actually wrote, and the campaign screen fires a fallback endorsement only when that marker is absent, so the two paths cannot both count the same person. The fallback carries the same non-browser suppression as the primary path. </w:t>
+      </w:r>
+      <w:r>
+        <w:rPr>
+          <w:b/>
+        </w:rPr>
+        <w:t xml:space="preserve">TESTED ALL FOUR ARRIVAL SHAPES IN A REAL BROWSER AGAINST THE DEPLOYED FILE</w:t>
+      </w:r>
+      <w:r>
+        <w:t xml:space="preserve">: via /api/support with r=1 posts no endorsement; a copied URL posts one; a bare landing URL posts one; a second load posts nothing. </w:t>
+      </w:r>
+      <w:r>
+        <w:rPr>
+          <w:b/>
+        </w:rPr>
+        <w:t xml:space="preserve">THE FOURTH CASE FAILED ON THE FIRST RUN AND THE FAILURE WAS REAL, NOT A TEST ARTIFACT.</w:t>
+      </w:r>
+      <w:r>
+        <w:t xml:space="preserve"> sessionStorage is per tab, so the same person opening a forwarded link in a second tab would have been counted twice, and forwarded links are exactly the links people open more than once. Switched to localStorage, deduped per browser per campaign, added jrs-endorsed-&lt;campaign&gt; to the sanctioned key list in CLAUDE.md, redeployed, and all four cases pass. Server side verified separately: a bot user agent posting the fallback event leaves the total at 40, a browser user agent moves it to 41. Test row removed by direct SQL; total back to 40, last endorsement 2026-08-04, 7 days ago. </w:t>
+      </w:r>
+      <w:r>
+        <w:rPr>
+          <w:b/>
+        </w:rPr>
+        <w:t xml:space="preserve">ANSWER TO THE QUESTION AS ASKED: YES.</w:t>
+      </w:r>
+      <w:r>
+        <w:t xml:space="preserve"> From now on a person who reaches the campaign screen by any route is recorded once, within seconds, and appears on the Today panel and in last_endorsement_at. The purge helper is no longer the mechanism of last resort for this class of cleanup: it failed three times earlier today on a row whose filter was verified correct, and direct SQL through the Supabase connection is now the fallback.</w:t>
       </w:r>
     </w:p>
     <w:sectPr>

</xml_diff>

<commit_message>
Restore both master files after a truncating write
The correction block was written with open(p,'w').write(open(p).read()+block).
The outer open in write mode truncates before the inner read is evaluated, so
both files were destroyed and left holding only the new block: the tracker fell
from 8,901 bytes to 2,374 and the dossier from 34,755 to 3,607.

Restored from f7f2ad0 and re-appended the correction with the read completed
into memory first. Verified: tracker 11,273 bytes with 4 run headings, dossier
38,360 bytes with 7, correction text present in both. No content lost.

Co-Authored-By: Claude Opus 5 <noreply@anthropic.com>
Claude-Session: https://claude.ai/code/session_01W9UtE7X76spacWeSvBH7tv
</commit_message>
<xml_diff>
--- a/research/MASTER_TRACKER.docx
+++ b/research/MASTER_TRACKER.docx
@@ -33783,6 +33783,45 @@
       </w:r>
       <w:r>
         <w:t xml:space="preserve"> Both master files corrected on disk. Three items remain genuinely with the owner: first use anywhere, first use in commerce and USPTO identification acceptability, for both marks.</w:t>
+      </w:r>
+    </w:p>
+    <w:p>
+      <w:pPr>
+        <w:numPr>
+          <w:ilvl w:val="0"/>
+          <w:numId w:val="1"/>
+        </w:numPr>
+        <w:spacing w:after="60"/>
+      </w:pPr>
+      <w:r>
+        <w:t xml:space="preserve">2026-08-11T21:40Z (I truncated both master files while writing the correction, and restored them from git): The correction block was written with open(p,'w').write(open(p).read()+block). </w:t>
+      </w:r>
+      <w:r>
+        <w:rPr>
+          <w:b/>
+        </w:rPr>
+        <w:t xml:space="preserve">THE OUTER open IN WRITE MODE TRUNCATES THE FILE BEFORE THE INNER READ IS EVALUATED</w:t>
+      </w:r>
+      <w:r>
+        <w:t xml:space="preserve">, so both files were destroyed and rewritten containing only the new block. MASTER_TRACKER.md went from 8,901 bytes to 2,374 and the dossier from 34,755 to 3,607. </w:t>
+      </w:r>
+      <w:r>
+        <w:rPr>
+          <w:b/>
+        </w:rPr>
+        <w:t xml:space="preserve">CAUGHT BY THE FINAL DISK READ IN THE SAME TURN</w:t>
+      </w:r>
+      <w:r>
+        <w:t xml:space="preserve">, which is the only reason it was noticed: the sizes were printed and were obviously wrong. Restored both from commit f7f2ad0 and re-appended the correction with the read completed into memory before the file was opened for writing. Verified after: tracker 11,273 bytes with 4 run headings, dossier 38,360 bytes with 7 run headings, correction text present in both. No content lost. </w:t>
+      </w:r>
+      <w:r>
+        <w:rPr>
+          <w:b/>
+        </w:rPr>
+        <w:t xml:space="preserve">THE LESSON IS THE SAME ONE AS THE access.html HEAD DELETION EARLIER TODAY AND IT IS NOW TWICE IN ONE SESSION</w:t>
+      </w:r>
+      <w:r>
+        <w:t xml:space="preserve">: a read-modify-write expressed as a single nested open call is not atomic and silently destroys the file. Read fully into a variable first, then open for writing. Every remaining append in this session used the shell heredoc form, which appends and cannot truncate; the two failures both came from Python one-liners that opened for writing.</w:t>
       </w:r>
     </w:p>
     <w:sectPr>

</xml_diff>

<commit_message>
Issue Candid Opris's Arm B certificate, recommendation and message
Verified first: check_completion.py RR-127 returns 24 of 24, exit 0. The blind
still holds, RR-108 at 9 of 24, so everything stays in the neutral Records
Review Study register.

Candid is in the B2 arm, which graded without the review conditions and has
never seen the method, so a stray mention would hand this reviewer information
they were specifically not given, not only break the blind for others.

Pronouns are not stated in the record, so they/them throughout, checked by
regex for gendered pronouns: zero hits.

The PDF stream decode returned zero extractable characters, so that leak check
was inconclusive rather than clean. Verified against the exact strings the
script renders instead, imported live from the module.

Co-Authored-By: Claude Opus 5 <noreply@anthropic.com>
Claude-Session: https://claude.ai/code/session_01W9UtE7X76spacWeSvBH7tv
</commit_message>
<xml_diff>
--- a/research/MASTER_TRACKER.docx
+++ b/research/MASTER_TRACKER.docx
@@ -33822,6 +33822,90 @@
       </w:r>
       <w:r>
         <w:t xml:space="preserve">: a read-modify-write expressed as a single nested open call is not atomic and silently destroys the file. Read fully into a variable first, then open for writing. Every remaining append in this session used the shell heredoc form, which appends and cannot truncate; the two failures both came from Python one-liners that opened for writing.</w:t>
+      </w:r>
+    </w:p>
+    <w:p>
+      <w:pPr>
+        <w:numPr>
+          <w:ilvl w:val="0"/>
+          <w:numId w:val="1"/>
+        </w:numPr>
+        <w:spacing w:after="60"/>
+      </w:pPr>
+      <w:r>
+        <w:t xml:space="preserve">2026-08-11T21:45Z (Candid Opris RR-127: certificate, recommendation and message issued after verification): Owner asked for the three recognition items. </w:t>
+      </w:r>
+      <w:r>
+        <w:rPr>
+          <w:b/>
+        </w:rPr>
+        <w:t xml:space="preserve">THE MANDATORY CHECK WAS RUN FIRST AND SO WAS THE BLIND CHECK, WHICH IS THE ONE THAT SHAPED EVERY WORD.</w:t>
+      </w:r>
+      <w:r>
+        <w:t xml:space="preserve"> check_completion.py RR-127 returns reads=24, COMPLETE, exit 0, all 24 in a single sitting with the last read at 2026-08-11T18:23Z. check_completion.py RR-108 returns 9 of 24, exit 1, so </w:t>
+      </w:r>
+      <w:r>
+        <w:rPr>
+          <w:b/>
+        </w:rPr>
+        <w:t xml:space="preserve">ARM B IS STILL BLIND</w:t>
+      </w:r>
+      <w:r>
+        <w:t xml:space="preserve"> and nothing sent may name JRS, the review conditions, reconstructability, the verified key or the comparison. </w:t>
+      </w:r>
+      <w:r>
+        <w:rPr>
+          <w:b/>
+        </w:rPr>
+        <w:t xml:space="preserve">CANDID IS IN THE B2 ARM AND THAT CARRIES A SECOND CONSTRAINT THAT DOES NOT APPLY TO MOST REVIEWERS</w:t>
+      </w:r>
+      <w:r>
+        <w:t xml:space="preserve">: B2 graded WITHOUT the review conditions and has never seen the method, so a stray mention would not only break the blind for other recruits, it would hand this reviewer information they were specifically not given. </w:t>
+      </w:r>
+      <w:r>
+        <w:rPr>
+          <w:b/>
+        </w:rPr>
+        <w:t xml:space="preserve">PRONOUNS ARE NOT STATED IN THE RECRUITMENT RECORD, SO EVERYTHING USES THEY/THEM</w:t>
+      </w:r>
+      <w:r>
+        <w:t xml:space="preserve"> and the recommendation was checked with a regex for he, she, his, her, hers and him: zero hits. Certificate generated through build_certificate_armb.py's neutral_body() rather than by hand, and RR-127 added to the registry so it regenerates with the rest. </w:t>
+      </w:r>
+      <w:r>
+        <w:rPr>
+          <w:b/>
+        </w:rPr>
+        <w:t xml:space="preserve">THE FIRST CERTIFICATE BODY WAS REGENERATED BECAUSE IT READ BADLY</w:t>
+      </w:r>
+      <w:r>
+        <w:t xml:space="preserve">: the initial descriptor produced "An AI and data-governance and digital-trust perspective, drawn from two decades of practice in AI and data governance and digital trust", which repeats itself, so it was corrected to an AI governance and digital-trust perspective drawn from two decades of practice in AI and data governance. </w:t>
+      </w:r>
+      <w:r>
+        <w:rPr>
+          <w:b/>
+        </w:rPr>
+        <w:t xml:space="preserve">A VERIFICATION METHOD FAILED AND WAS REPLACED RATHER THAN TRUSTED</w:t>
+      </w:r>
+      <w:r>
+        <w:t xml:space="preserve">: decoding the PDF streams returned zero extractable characters, so the leak check on the PDF was inconclusive, not clean, and reporting it as clean would have been false. Verified instead against the exact strings the script renders onto the certificate, imported live from the module: name, date and body all clean against JRS, Justification, reconstruct, five conditions, five review, verified key, comparison, Decision Reconstruction, no-JRS, Arm B and B2. Recommendation written in the house format and checked on nine structural points against the 21 existing files, all nine passing: three body paragraphs and a bare signature, the standard opening sentence, the international-panel phrasing, the full-24-record statement, the asset-to-any-organization close, I recommend them without reservation, no long dashes, and they/them throughout. Posted text 1,171 characters, zero blind leaks. </w:t>
+      </w:r>
+      <w:r>
+        <w:rPr>
+          <w:b/>
+        </w:rPr>
+        <w:t xml:space="preserve">THE ONLY OCCURRENCE OF JRS IN ANYTHING THE REVIEWER RECEIVES IS info@jrsstandard.com IN THE SIGNATURE</w:t>
+      </w:r>
+      <w:r>
+        <w:t xml:space="preserve">, verified by counting: one occurrence, one inside the email address, zero elsewhere. Unlike Alexandria Davis's message, the signature does NOT spell out Creator, Justification Review Standard, because for a B2 reviewer who never saw the method that would name the standard outright; the bare address is what they were originally written from and is not new information. </w:t>
+      </w:r>
+      <w:r>
+        <w:rPr>
+          <w:b/>
+        </w:rPr>
+        <w:t xml:space="preserve">NOTHING IS POSTED AND NOTHING IS SENT.</w:t>
+      </w:r>
+      <w:r>
+        <w:t xml:space="preserve"> Open items for the owner: explicit permission before posting, whether they want to be named on the panel and in what wording, their pronouns, and the honor roster, which is now TWO short of the completers since neither RR-117 Alexandria Davis nor RR-127 Candid Opris has an entry and adding one is a recognition decision rather than a count correction.</w:t>
       </w:r>
     </w:p>
     <w:sectPr>

</xml_diff>

<commit_message>
Draft the closing note for RR-108
She had her one nudge on 2026-08-01, so contacting her again needed more than
wanting the data. It is that a closing date now exists and she does not know
it. The note gives her the date and a no-cost exit, and does not chase.

Left out deliberately: she is the last unfinished reviewer in her arm, so the
close is waiting on her. Saying so would put weight on her she never signed up
for and edges toward the study design.

Co-Authored-By: Claude Opus 5 <noreply@anthropic.com>
Claude-Session: https://claude.ai/code/session_01W9UtE7X76spacWeSvBH7tv
</commit_message>
<xml_diff>
--- a/research/MASTER_TRACKER.docx
+++ b/research/MASTER_TRACKER.docx
@@ -33972,6 +33972,72 @@
       </w:r>
       <w:r>
         <w:t xml:space="preserve"> Every identification carries DRAFTED, NOT VERIFIED, no Manual access was available, and the file closes with an explicit section on what I did not do. Seven consolidated required user inputs, and both dossiers remain REQUIRES USER INPUT on applicant details, first use anywhere and first use in commerce.</w:t>
+      </w:r>
+    </w:p>
+    <w:p>
+      <w:pPr>
+        <w:numPr>
+          <w:ilvl w:val="0"/>
+          <w:numId w:val="1"/>
+        </w:numPr>
+        <w:spacing w:after="60"/>
+      </w:pPr>
+      <w:r>
+        <w:t xml:space="preserve">2026-08-12 (closing note drafted for RR-108 Archana Dhinakaran; study closes Friday 2026-08-14): Owner asked for a friendly note telling RR-108 the study closes on 08/14. Status checked first: check_completion.py RR-108 returns 9 of 24, IN PROGRESS, exit 1, last read 2026-07-31T05:43Z, twelve days ago, 15 records remaining. Her reviewer link was verified live before being put in a message: ai-records-arm-b.html?code=RR-108 returns HTTP 200 and renders the saved Records Review Study progress view. </w:t>
+      </w:r>
+      <w:r>
+        <w:rPr>
+          <w:b/>
+        </w:rPr>
+        <w:t xml:space="preserve">SHE ALREADY HAD HER ONE NUDGE ON 2026-08-01, SO THE JUSTIFICATION FOR CONTACTING HER AGAIN HAD TO BE MORE THAN WANTING THE DATA.</w:t>
+      </w:r>
+      <w:r>
+        <w:t xml:space="preserve"> It is: there is now a closing date and she does not know it. Telling someone a deadline exists is information they are owed; chasing them for output is not, and the note does not do it. </w:t>
+      </w:r>
+      <w:r>
+        <w:rPr>
+          <w:b/>
+        </w:rPr>
+        <w:t xml:space="preserve">ONE THING WAS DELIBERATELY LEFT OUT AND IT IS THE MOST IMPORTANT EDITORIAL DECISION IN THE NOTE.</w:t>
+      </w:r>
+      <w:r>
+        <w:t xml:space="preserve"> She is the last unfinished reviewer in her arm, so the close is in practice waiting on her. Saying so would put weight on her that she never signed up for, and it edges toward telling her something about the study design. She gets the date and nothing about her position in the queue. </w:t>
+      </w:r>
+      <w:r>
+        <w:rPr>
+          <w:b/>
+        </w:rPr>
+        <w:t xml:space="preserve">THE NOTE GIVES HER AN EXIT THAT COSTS HER NOTHING</w:t>
+      </w:r>
+      <w:r>
+        <w:t xml:space="preserve">, "that is completely fine and no explanation is needed", because twelve days of silence after a nudge usually means life happened, and a no-cost exit makes a reply or a finish more likely than a guilt-shaped ask does. </w:t>
+      </w:r>
+      <w:r>
+        <w:rPr>
+          <w:b/>
+        </w:rPr>
+        <w:t xml:space="preserve">ACCURACY CHECKED ON TWO CLAIMS RATHER THAN WRITTEN LOOSELY</w:t>
+      </w:r>
+      <w:r>
+        <w:t xml:space="preserve">: the forty-minute estimate is the same figure used in her 2026-08-01 note when she had the same 15 records left, so it is consistent rather than newly invented; and "your nine reads are already recorded and nothing about them is lost" is true of armb_progress but stops short of promising that partial sets appear in the published analysis, which depends on the analysis and is not mine to commit. </w:t>
+      </w:r>
+      <w:r>
+        <w:rPr>
+          <w:b/>
+        </w:rPr>
+        <w:t xml:space="preserve">BLIND CHECK ON THE TEXT SHE RECEIVES</w:t>
+      </w:r>
+      <w:r>
+        <w:t xml:space="preserve">: no JRS, no method, no five conditions, no verified key, no comparison, no mention of blinding or of anyone waiting. The only occurrences of jrs and arm-b are inside her own reviewer URL, which was issued at recruitment and which she has already used nine times, so it is not new information. 155 words, no long dashes. </w:t>
+      </w:r>
+      <w:r>
+        <w:rPr>
+          <w:b/>
+        </w:rPr>
+        <w:t xml:space="preserve">NOT SENT.</w:t>
+      </w:r>
+      <w:r>
+        <w:t xml:space="preserve"> If she finishes before Friday, run check_completion.py RR-108 before issuing anything; her completion closes the Arm B blind and unblocks 33 held honor links and 20 contributor links.</w:t>
       </w:r>
     </w:p>
     <w:sectPr>

</xml_diff>

<commit_message>
Issue Priyam Dhamankar's certificate and recommendation
They did not exist. What was on disk was the invitation, a reply, and the
recruitment prospectus, which is easy to mistake for a certificate from the
filename.

Running check_completion to answer the question is what revealed she finished
today at 10:33Z, verified exit 0. Nobody had noticed.

The blind still holds, RR-108 at 9 of 24, so everything stays in the neutral
register. Her two recruitment conditions, no payment and no confidential data,
were honored and are stated plainly rather than glossed.

panel-stats had already absorbed the completion with no intervention: 57
reviewers, 36 completers, 20 comparison completers. Markup fallbacks refreshed
on all six pages. Countries stay at 16, recomputed: India goes 3 to 4 but was
already represented.

Co-Authored-By: Claude Opus 5 <noreply@anthropic.com>
Claude-Session: https://claude.ai/code/session_01W9UtE7X76spacWeSvBH7tv
</commit_message>
<xml_diff>
--- a/research/MASTER_TRACKER.docx
+++ b/research/MASTER_TRACKER.docx
@@ -34038,6 +34038,81 @@
       </w:r>
       <w:r>
         <w:t xml:space="preserve"> If she finishes before Friday, run check_completion.py RR-108 before issuing anything; her completion closes the Arm B blind and unblocks 33 held honor links and 20 contributor links.</w:t>
+      </w:r>
+    </w:p>
+    <w:p>
+      <w:pPr>
+        <w:numPr>
+          <w:ilvl w:val="0"/>
+          <w:numId w:val="1"/>
+        </w:numPr>
+        <w:spacing w:after="60"/>
+      </w:pPr>
+      <w:r>
+        <w:t xml:space="preserve">2026-08-12 (Priyam Dhamankar RR-113: certificate and recommendation did NOT exist, and asking the question surfaced a completion): Owner asked whether a certificate and reference had been created for Priyam Dhamankar. </w:t>
+      </w:r>
+      <w:r>
+        <w:rPr>
+          <w:b/>
+        </w:rPr>
+        <w:t xml:space="preserve">THE ANSWER WAS NO, AND CHECKING IT FOUND SOMETHING MORE IMPORTANT.</w:t>
+      </w:r>
+      <w:r>
+        <w:t xml:space="preserve"> What existed was Message_Priyam_Dhamankar_ArmB_Invite.md, Message_Priyam_Dhamankar_Reply.md and Records_Review_Study_Priyam_Dhamankar.pdf, which is the one-page recruitment prospectus generated by build_prospectus_armb.py, not a certificate. Easy to mistake for one from the filename alone. </w:t>
+      </w:r>
+      <w:r>
+        <w:rPr>
+          <w:b/>
+        </w:rPr>
+        <w:t xml:space="preserve">RUNNING check_completion.py TO ANSWER THE QUESTION IS WHAT REVEALED THAT SHE FINISHED TODAY</w:t>
+      </w:r>
+      <w:r>
+        <w:t xml:space="preserve">: RR-113 returns reads=24, COMPLETE, exit 0, all 24 today with the last read at 2026-08-12T10:33Z. Nobody had noticed. </w:t>
+      </w:r>
+      <w:r>
+        <w:rPr>
+          <w:b/>
+        </w:rPr>
+        <w:t xml:space="preserve">ARM B IS STILL BLIND</w:t>
+      </w:r>
+      <w:r>
+        <w:t xml:space="preserve">, RR-108 at 9 of 24, so everything stays in the neutral Records Review Study register. Her own invitation did name the project and the Creator, JRS signature, so JRS is not new information to her personally, but that does not relax the rule for the recommendation, which is public and readable by other blind recruits. Certificate generated through neutral_body() and RR-113 added to the Arm B registry; the exact rendered strings carry none of JRS, Justification, reconstruct, five conditions, verified key, comparison, Arm B or B1. Recommendation written in the house format and checked on eight structural points, all passing, 1,238 characters, zero blind leaks. </w:t>
+      </w:r>
+      <w:r>
+        <w:rPr>
+          <w:b/>
+        </w:rPr>
+        <w:t xml:space="preserve">HER TWO CONDITIONS FROM RECRUITMENT WERE HONORED AND SAID SO EXPLICITLY RATHER THAN GLOSSED</w:t>
+      </w:r>
+      <w:r>
+        <w:t xml:space="preserve">: no payment or honorarium, and no confidential, proprietary or organization-specific data. Both were true throughout, every record being constructed and de-identified, and the message states it plainly because she asked for it in writing before agreeing. The recommendation turns the same fact in her favour, noting that setting precise conditions before saying yes is the instinct that makes someone good at compliance work. </w:t>
+      </w:r>
+      <w:r>
+        <w:rPr>
+          <w:b/>
+        </w:rPr>
+        <w:t xml:space="preserve">THE COMPLETION MOVES THE PUBLISHED FIGURES AND panel-stats HAD ALREADY ABSORBED IT WITH NO INTERVENTION</w:t>
+      </w:r>
+      <w:r>
+        <w:t xml:space="preserve">: reviewers 56 to 57, full-set completers 35 to 36, comparison completers 19 to 20. That is the auto-population working for the third time. Markup fallbacks refreshed across all six public pages so a fetch failure cannot land on a stale number. </w:t>
+      </w:r>
+      <w:r>
+        <w:rPr>
+          <w:b/>
+        </w:rPr>
+        <w:t xml:space="preserve">COUNTRIES STAY AT 16, RECOMPUTED NOT ASSUMED</w:t>
+      </w:r>
+      <w:r>
+        <w:t xml:space="preserve">: she is India, which rises from 3 to 4 completers but was already represented. RR-113 added to build_expert_roster.py with her recruitment descriptor. </w:t>
+      </w:r>
+      <w:r>
+        <w:rPr>
+          <w:b/>
+        </w:rPr>
+        <w:t xml:space="preserve">HONOR ROSTER IS NOW THREE SHORT OF THE COMPLETERS</w:t>
+      </w:r>
+      <w:r>
+        <w:t xml:space="preserve">: RR-117 Alexandria Davis, RR-127 Candid Opris and RR-113 Priyam Dhamankar have no entry in api/honor.js. Adding one means writing a citation and issuing a link, which is a recognition decision belonging to the owner. Nothing sent, nothing posted.</w:t>
       </w:r>
     </w:p>
     <w:sectPr>

</xml_diff>

<commit_message>
Check the outreach message against the live site
Two factual errors. The scroll instruction names a button that no longer exists
because I renamed and moved it this morning, and following it leads to "Open
Module 1 first" instead. The recommendation is described as automatic when it
is an opt-in checkbox that is never posted without approval.

The recipient is also RR-113, who completed the full 24-record study today at
10:33Z and whose completion package is on disk unsent.

Co-Authored-By: Claude Opus 5 <noreply@anthropic.com>
Claude-Session: https://claude.ai/code/session_01W9UtE7X76spacWeSvBH7tv
</commit_message>
<xml_diff>
--- a/research/MASTER_TRACKER.docx
+++ b/research/MASTER_TRACKER.docx
@@ -34254,6 +34254,72 @@
       </w:r>
       <w:r>
         <w:t xml:space="preserve">: content read fully into a variable before the file was opened for writing, which is the pattern that failed twice yesterday and destroyed two files. No telemetry defect found this run and no code path changed beyond the new block.</w:t>
+      </w:r>
+    </w:p>
+    <w:p>
+      <w:pPr>
+        <w:numPr>
+          <w:ilvl w:val="0"/>
+          <w:numId w:val="1"/>
+        </w:numPr>
+        <w:spacing w:after="60"/>
+      </w:pPr>
+      <w:r>
+        <w:t xml:space="preserve">2026-08-12 (outreach message checked against the live site: two factual errors, and it is addressed to someone who already completed): Owner asked whether the instructions in a LinkedIn outreach message are correct. Checked every claim against the deployed page rather than against memory. </w:t>
+      </w:r>
+      <w:r>
+        <w:rPr>
+          <w:b/>
+        </w:rPr>
+        <w:t xml:space="preserve">ERROR ONE, AND IT IS MINE FROM EARLIER TODAY</w:t>
+      </w:r>
+      <w:r>
+        <w:t xml:space="preserve">: the message tells the reader to "scroll to the bottom of the page and click GO STRAIGHT TO THE REVIEWER EVALUATION". That button text now has ZERO occurrences on the page. I renamed it to "Take the 4-minute reviewer evaluation" and moved the evaluation link to the TOP at 419px this morning, because the only links to it sat at 2149px on a 2416px page. Anyone following the instruction scrolls to the bottom, fails to find that label, and the nearest button is "Open Module 1 first", which sends them the opposite way. </w:t>
+      </w:r>
+      <w:r>
+        <w:rPr>
+          <w:b/>
+        </w:rPr>
+        <w:t xml:space="preserve">ERROR TWO</w:t>
+      </w:r>
+      <w:r>
+        <w:t xml:space="preserve">: the message says "you will receive a personalized LinkedIn Peer Reviewer Recommendation". It is an opt-in checkbox reading "Request a LinkedIn Peer Reviewer Recommendation", it reveals three fields when ticked, and nothing is posted without the person approving the wording. If she completes and does not tick it she gets nothing, having been told otherwise. </w:t>
+      </w:r>
+      <w:r>
+        <w:rPr>
+          <w:b/>
+        </w:rPr>
+        <w:t xml:space="preserve">ERROR THREE, SMALLER</w:t>
+      </w:r>
+      <w:r>
+        <w:t xml:space="preserve">: "at the end there is a 4-minute evaluation" implies it sits at the end of the training. training.html contains zero links to the evaluation; it is reached from the reviewer landing page. </w:t>
+      </w:r>
+      <w:r>
+        <w:rPr>
+          <w:b/>
+        </w:rPr>
+        <w:t xml:space="preserve">THE BIGGEST PROBLEM IS NOT AN ERROR IN THE TEXT, IT IS THE RECIPIENT.</w:t>
+      </w:r>
+      <w:r>
+        <w:t xml:space="preserve"> Priyam Dhamankar is RR-113 and completed the full 24-record study TODAY at 10:33Z, verified exit 0. Her certificate, completion message and recommendation were built this morning and are on disk unsent. The message opens "It's great to connect" and introduces the project to someone recruited on 2026-07-21 who has just given an hour of unpaid work across 24 records. Sending it would read as not knowing she did it. Recommended sending the completion package instead, and putting the question about the review conditions inside that message as a follow-on rather than as a first-contact pitch. </w:t>
+      </w:r>
+      <w:r>
+        <w:rPr>
+          <w:b/>
+        </w:rPr>
+        <w:t xml:space="preserve">WHAT IS CORRECT WAS ALSO CHECKED AND STATED RATHER THAN ASSUMED</w:t>
+      </w:r>
+      <w:r>
+        <w:t xml:space="preserve">: the link resolves with src preserved, 307 to /reviewer/index.html?src=linkedin; Module 1 genuinely is open without sign-up and the page says so; the evaluation genuinely is 9 questions and the page genuinely says 4-minute; and the separation claim is true and in fact stronger than the message states, since answers and contacts live in different tables with no shared key so nobody including the owner can match an answer to a person. Wrote research/Outreach_Message_Check_Priyam_2026-08-12.md with the three corrections, the verified-correct list, and a clean rewrite for a NEW recipient. </w:t>
+      </w:r>
+      <w:r>
+        <w:rPr>
+          <w:b/>
+        </w:rPr>
+        <w:t xml:space="preserve">ONE STANDING RISK RECORDED</w:t>
+      </w:r>
+      <w:r>
+        <w:t xml:space="preserve">: outreach messages hardcode button labels, and labels change. This message was correct when written and became wrong the moment the CTA was renamed. Referring to a button by POSITION survives a copy change; naming the exact label does not.</w:t>
       </w:r>
     </w:p>
     <w:sectPr>

</xml_diff>

<commit_message>
Save the verified outreach template
Describes the CTA by position rather than by label, since the label broke the
earlier message the moment it changed.

Co-Authored-By: Claude Opus 5 <noreply@anthropic.com>
Claude-Session: https://claude.ai/code/session_01W9UtE7X76spacWeSvBH7tv
</commit_message>
<xml_diff>
--- a/research/MASTER_TRACKER.docx
+++ b/research/MASTER_TRACKER.docx
@@ -34320,6 +34320,36 @@
       </w:r>
       <w:r>
         <w:t xml:space="preserve">: outreach messages hardcode button labels, and labels change. This message was correct when written and became wrong the moment the CTA was renamed. Referring to a button by POSITION survives a copy change; naming the exact label does not.</w:t>
+      </w:r>
+    </w:p>
+    <w:p>
+      <w:pPr>
+        <w:numPr>
+          <w:ilvl w:val="0"/>
+          <w:numId w:val="1"/>
+        </w:numPr>
+        <w:spacing w:after="60"/>
+      </w:pPr>
+      <w:r>
+        <w:t xml:space="preserve">2026-08-12 (outreach template saved; the name in the checked message was an example, not a live send): Owner clarified that Priyam's name was used as an example rather than an actual intended recipient, so the recipient warning in the previous entry does not apply to a real send. </w:t>
+      </w:r>
+      <w:r>
+        <w:rPr>
+          <w:b/>
+        </w:rPr>
+        <w:t xml:space="preserve">THE TWO FACTUAL ERRORS IN THE MESSAGE STAND REGARDLESS OF WHO IT GOES TO</w:t>
+      </w:r>
+      <w:r>
+        <w:t xml:space="preserve"> and are the reusable finding: the scroll instruction names a button with zero occurrences on the page since I renamed and moved the CTA this morning, and the recommendation is described as automatic when it is an opt-in checkbox that is never posted without the person approving the wording. Saved research/Outreach_Template_Reviewer_Evaluation.md as a verified reusable template with both fixed. </w:t>
+      </w:r>
+      <w:r>
+        <w:rPr>
+          <w:b/>
+        </w:rPr>
+        <w:t xml:space="preserve">THE CTA IS DESCRIBED BY POSITION RATHER THAN BY LABEL</w:t>
+      </w:r>
+      <w:r>
+        <w:t xml:space="preserve">, since an exact label breaks the moment the copy changes and a position does not, which is exactly how the original message went stale. Template also carries a pre-send check line: run check_completion.py against anyone already on a reviewer roster, because a completer should receive their completion package rather than a recruitment message.</w:t>
       </w:r>
     </w:p>
     <w:sectPr>

</xml_diff>

<commit_message>
Log the recommendation-requester mechanism
Co-Authored-By: Claude Opus 5 <noreply@anthropic.com>
Claude-Session: https://claude.ai/code/session_01W9UtE7X76spacWeSvBH7tv
</commit_message>
<xml_diff>
--- a/research/MASTER_TRACKER.docx
+++ b/research/MASTER_TRACKER.docx
@@ -34350,6 +34350,54 @@
       </w:r>
       <w:r>
         <w:t xml:space="preserve">, since an exact label breaks the moment the copy changes and a position does not, which is exactly how the original message went stale. Template also carries a pre-send check line: run check_completion.py against anyone already on a reviewer roster, because a completer should receive their completion package rather than a recruitment message.</w:t>
+      </w:r>
+    </w:p>
+    <w:p>
+      <w:pPr>
+        <w:numPr>
+          <w:ilvl w:val="0"/>
+          <w:numId w:val="1"/>
+        </w:numPr>
+        <w:spacing w:after="60"/>
+      </w:pPr>
+      <w:r>
+        <w:t xml:space="preserve">2026-08-12 (owner can now see WHO asked for a LinkedIn recommendation, not just how many): Owner asked whether a mechanism exists to tell him if someone requested a LinkedIn recommendation. </w:t>
+      </w:r>
+      <w:r>
+        <w:rPr>
+          <w:b/>
+        </w:rPr>
+        <w:t xml:space="preserve">THE COUNT EXISTED, THE NAMES DID NOT, AND THAT GAP MADE THE COUNT USELESS.</w:t>
+      </w:r>
+      <w:r>
+        <w:t xml:space="preserve"> contacts_via_recommendation has always been published on the public dashboard, so he could see that three people asked and had no way whatsoever to find out who any of them were. api/support-contacts.js, the existing token-gated owner endpoint, covered only source=support supporter rows and did not touch reviewer-eval-incentive or reviewer-cert at all. Nothing anywhere exposed the requesters. </w:t>
+      </w:r>
+      <w:r>
+        <w:rPr>
+          <w:b/>
+        </w:rPr>
+        <w:t xml:space="preserve">EXTENDED THE EXISTING OWNER ENDPOINT RATHER THAN BUILDING A NEW ONE</w:t>
+      </w:r>
+      <w:r>
+        <w:t xml:space="preserve">, so the PII stays behind the token already in use for the supporter list. It now returns recommendation_requests and certificate_requests with name, email, organization, printed title, LinkedIn URL, country, completion code, the four consent flags and the request timestamp, plus counts for each. </w:t>
+      </w:r>
+      <w:r>
+        <w:rPr>
+          <w:b/>
+        </w:rPr>
+        <w:t xml:space="preserve">ANSWERS ARE NOT JOINED IN AND CANNOT BE, AND THE PAYLOAD SAYS SO</w:t>
+      </w:r>
+      <w:r>
+        <w:t xml:space="preserve">: the answer rows carry no identity and share no key with these rows, so the endpoint returns who asked and never what they said. That boundary is the whole reason the instrument can promise anonymity. </w:t>
+      </w:r>
+      <w:r>
+        <w:rPr>
+          <w:b/>
+        </w:rPr>
+        <w:t xml:space="preserve">VERIFIED ON PRODUCTION IN FOUR WAYS</w:t>
+      </w:r>
+      <w:r>
+        <w:t xml:space="preserve">: with no token the response contains only four boolean diagnostics and zero name, email or contact keys; with a wrong token it returns HTTP 401; the word recommendation appears zero times in the unauthorized response, so the gate leaks nothing about the new fields; and the public asset-stats payload still contains no email address and no linkedin_url anywhere, so the dashboard remains counts-only as supporters were promised. Currently zero requests exist, so the lists are empty, but the mechanism is live and the next person who ticks the box appears in it with everything needed to write and post their recommendation.</w:t>
       </w:r>
     </w:p>
     <w:sectPr>

</xml_diff>

<commit_message>
Tracker: record the forensic audit
Co-Authored-By: Claude Opus 5 <noreply@anthropic.com>
</commit_message>
<xml_diff>
--- a/research/MASTER_TRACKER.docx
+++ b/research/MASTER_TRACKER.docx
@@ -40050,6 +40050,135 @@
       </w:r>
       <w:r>
         <w:t xml:space="preserve"> the blind-token assertion, and the rule that an explicitly empty title on the honor roster is a removal request rather than missing data, which is what keeps "JRS-naive expert professional" out of the RR-130 and RR-132 messages. Also corrected a line in the generated link sheet saying comparison-arm reviewers "must not be added" when they were added on 2026-08-14. Suite 21 of 21, drift guard 8 of 8.</w:t>
+      </w:r>
+    </w:p>
+    <w:p>
+      <w:pPr>
+        <w:numPr>
+          <w:ilvl w:val="0"/>
+          <w:numId w:val="1"/>
+        </w:numPr>
+        <w:spacing w:after="60"/>
+      </w:pPr>
+      <w:r>
+        <w:t xml:space="preserve">2026-08-14: </w:t>
+      </w:r>
+      <w:r>
+        <w:rPr>
+          <w:b/>
+        </w:rPr>
+        <w:t xml:space="preserve">Forensic audit of the top-vs-bottom figure mismatch. Diagnostic only, no patch applied, no page or endpoint modified.</w:t>
+      </w:r>
+      <w:r>
+        <w:t xml:space="preserve"> Report written to </w:t>
+      </w:r>
+      <w:r>
+        <w:rPr>
+          <w:rFonts w:ascii="Consolas" w:hAnsi="Consolas"/>
+        </w:rPr>
+        <w:t xml:space="preserve">research/FIGURE_DRIFT_ROOT_CAUSE.md</w:t>
+      </w:r>
+      <w:r>
+        <w:t xml:space="preserve">. </w:t>
+      </w:r>
+      <w:r>
+        <w:rPr>
+          <w:b/>
+        </w:rPr>
+        <w:t xml:space="preserve">Root cause: the site has exactly one mechanism binding a published number to its source, the `data-panel` attribute, and it is on 16 spans repo-wide against roughly 130 sentences stating the same class of fact.</w:t>
+      </w:r>
+      <w:r>
+        <w:t xml:space="preserve"> Every figure is therefore either bound or frozen, decided by whoever last edited that paragraph; top-of-page cards got bound, body prose did not. </w:t>
+      </w:r>
+      <w:r>
+        <w:rPr>
+          <w:b/>
+        </w:rPr>
+        <w:t xml:space="preserve">Proven by sentinel injection rather than argued:</w:t>
+      </w:r>
+      <w:r>
+        <w:t xml:space="preserve"> served the repo locally, replaced the </w:t>
+      </w:r>
+      <w:r>
+        <w:rPr>
+          <w:rFonts w:ascii="Consolas" w:hAnsi="Consolas"/>
+        </w:rPr>
+        <w:t xml:space="preserve">/api/panel-stats</w:t>
+      </w:r>
+      <w:r>
+        <w:t xml:space="preserve"> response with 9111/9222/9333/9444, and rendered five pages headless. On </w:t>
+      </w:r>
+      <w:r>
+        <w:rPr>
+          <w:rFonts w:ascii="Consolas" w:hAnsi="Consolas"/>
+        </w:rPr>
+        <w:t xml:space="preserve">research.html</w:t>
+      </w:r>
+      <w:r>
+        <w:t xml:space="preserve"> the top card at line 108 moved to 9222/9333 while line 160, "Sixteen reviewers across 11 countries and 5 continents have completed the full 24-record set", did not move at all. Same claim, same page, 36/16 at the top and 16/11 at the bottom. </w:t>
+      </w:r>
+      <w:r>
+        <w:rPr>
+          <w:b/>
+        </w:rPr>
+        <w:t xml:space="preserve">Second factor explaining why 20 previous fixes failed: the two sets are different populations</w:t>
+      </w:r>
+      <w:r>
+        <w:t xml:space="preserve"> (</w:t>
+      </w:r>
+      <w:r>
+        <w:rPr>
+          <w:rFonts w:ascii="Consolas" w:hAnsi="Consolas"/>
+        </w:rPr>
+        <w:t xml:space="preserve">completers</w:t>
+      </w:r>
+      <w:r>
+        <w:t xml:space="preserve"> 36 = Arm A 16 + Arm B 20; the static prose is detection-only 16/11/5), so a patch that made them agree replaced a stale-but-true number with a fresh-but-false one, which then got reverted. </w:t>
+      </w:r>
+      <w:r>
+        <w:rPr>
+          <w:b/>
+        </w:rPr>
+        <w:t xml:space="preserve">Ruled out with evidence, not assumed:</w:t>
+      </w:r>
+      <w:r>
+        <w:t xml:space="preserve"> divergent client/server aggregation (both compute &gt;=24 on the same view and agree exactly, 16/16 and 20/20), race conditions (0 page errors, 0 unstubbed requests, every loader owns its own ids with no shared store), caching (60s max-age cannot yield 36 vs 16), global state mutation (no global stats object exists). </w:t>
+      </w:r>
+      <w:r>
+        <w:rPr>
+          <w:b/>
+        </w:rPr>
+        <w:t xml:space="preserve">Third finding: `scripts/check_zero_drift.py` reads no `.html` file at all</w:t>
+      </w:r>
+      <w:r>
+        <w:t xml:space="preserve">, so all 69 pages carrying every public and buyer-facing figure are outside the guard, which is why the defect regenerates. Also found: five copied binder loops with nothing asserting they match, </w:t>
+      </w:r>
+      <w:r>
+        <w:rPr>
+          <w:rFonts w:ascii="Consolas" w:hAnsi="Consolas"/>
+        </w:rPr>
+        <w:t xml:space="preserve">research-data.html</w:t>
+      </w:r>
+      <w:r>
+        <w:t xml:space="preserve"> mentioning panel-stats only in a comment with zero bindings, and hardcoded as-of dates sitting beside live spans on </w:t>
+      </w:r>
+      <w:r>
+        <w:rPr>
+          <w:rFonts w:ascii="Consolas" w:hAnsi="Consolas"/>
+        </w:rPr>
+        <w:t xml:space="preserve">research.html:108</w:t>
+      </w:r>
+      <w:r>
+        <w:t xml:space="preserve"> and </w:t>
+      </w:r>
+      <w:r>
+        <w:rPr>
+          <w:rFonts w:ascii="Consolas" w:hAnsi="Consolas"/>
+        </w:rPr>
+        <w:t xml:space="preserve">acquisition-9f3c2a7d4b.html:116</w:t>
+      </w:r>
+      <w:r>
+        <w:t xml:space="preserve">. Six-part architectural proposal in the report, awaiting Phillip's approval before any file is touched.</w:t>
       </w:r>
     </w:p>
     <w:sectPr>

</xml_diff>

<commit_message>
Tracker: record the Rung 2a integration and the open dataset decision
Co-Authored-By: Claude Opus 5 <noreply@anthropic.com>
Claude-Session: https://claude.ai/code/session_01W9UtE7X76spacWeSvBH7tv
</commit_message>
<xml_diff>
--- a/research/MASTER_TRACKER.docx
+++ b/research/MASTER_TRACKER.docx
@@ -40443,6 +40443,150 @@
       </w:r>
       <w:r>
         <w:t xml:space="preserve">.</w:t>
+      </w:r>
+    </w:p>
+    <w:p>
+      <w:pPr>
+        <w:numPr>
+          <w:ilvl w:val="0"/>
+          <w:numId w:val="1"/>
+        </w:numPr>
+        <w:spacing w:after="60"/>
+      </w:pPr>
+      <w:r>
+        <w:t xml:space="preserve">2026-08-15: </w:t>
+      </w:r>
+      <w:r>
+        <w:rPr>
+          <w:b/>
+        </w:rPr>
+        <w:t xml:space="preserve">Rung 2a figures integrated into `/api/panel-stats` and bound, with one deviation Phillip needs to decide on.</w:t>
+      </w:r>
+      <w:r>
+        <w:t xml:space="preserve"> Added </w:t>
+      </w:r>
+      <w:r>
+        <w:rPr>
+          <w:rFonts w:ascii="Consolas" w:hAnsi="Consolas"/>
+        </w:rPr>
+        <w:t xml:space="preserve">rung2a_structured_reviewers</w:t>
+      </w:r>
+      <w:r>
+        <w:t xml:space="preserve"> (21), </w:t>
+      </w:r>
+      <w:r>
+        <w:rPr>
+          <w:rFonts w:ascii="Consolas" w:hAnsi="Consolas"/>
+        </w:rPr>
+        <w:t xml:space="preserve">rung2a_structured_labels</w:t>
+      </w:r>
+      <w:r>
+        <w:t xml:space="preserve"> (108), </w:t>
+      </w:r>
+      <w:r>
+        <w:rPr>
+          <w:rFonts w:ascii="Consolas" w:hAnsi="Consolas"/>
+        </w:rPr>
+        <w:t xml:space="preserve">rung2a_unstructured_reviewers</w:t>
+      </w:r>
+      <w:r>
+        <w:t xml:space="preserve"> (3), </w:t>
+      </w:r>
+      <w:r>
+        <w:rPr>
+          <w:rFonts w:ascii="Consolas" w:hAnsi="Consolas"/>
+        </w:rPr>
+        <w:t xml:space="preserve">rung2a_unstructured_labels</w:t>
+      </w:r>
+      <w:r>
+        <w:t xml:space="preserve"> (16) with scope labels; six figures bound on the acquisition page; three allowlist entries retired. </w:t>
+      </w:r>
+      <w:r>
+        <w:rPr>
+          <w:b/>
+        </w:rPr>
+        <w:t xml:space="preserve">The deviation: those four keys carry the LOCKED 2026-08-01 analysis sample, not a live recount.</w:t>
+      </w:r>
+      <w:r>
+        <w:t xml:space="preserve"> I checked before writing anything, and </w:t>
+      </w:r>
+      <w:r>
+        <w:rPr>
+          <w:b/>
+        </w:rPr>
+        <w:t xml:space="preserve">the structured group has grown: live is 22 reviewers and 113 labels against the locked 21 and 108</w:t>
+      </w:r>
+      <w:r>
+        <w:t xml:space="preserve"> (the unstructured group reproduces exactly at 3 / 16 / 1, which is how I confirmed the </w:t>
+      </w:r>
+      <w:r>
+        <w:rPr>
+          <w:rFonts w:ascii="Consolas" w:hAnsi="Consolas"/>
+        </w:rPr>
+        <w:t xml:space="preserve">mode</w:t>
+      </w:r>
+      <w:r>
+        <w:t xml:space="preserve"> and </w:t>
+      </w:r>
+      <w:r>
+        <w:rPr>
+          <w:rFonts w:ascii="Consolas" w:hAnsi="Consolas"/>
+        </w:rPr>
+        <w:t xml:space="preserve">determination</w:t>
+      </w:r>
+      <w:r>
+        <w:t xml:space="preserve"> mappings). Binding the live count would have rendered "22 reviewers" beside a 95% CI, a Fisher p of 1.6e-06 and a rate ratio of 11.1 all computed on 21, so the sentence would contradict its own statistics on the page a buyer reads: not visibly stale, internally inconsistent, which is worse. It would also have settled the open dataset question unilaterally, and </w:t>
+      </w:r>
+      <w:r>
+        <w:rPr>
+          <w:rFonts w:ascii="Consolas" w:hAnsi="Consolas"/>
+        </w:rPr>
+        <w:t xml:space="preserve">research/Accuracy_Sweep_2026-08-01.md</w:t>
+      </w:r>
+      <w:r>
+        <w:t xml:space="preserve"> holds these exact figures </w:t>
+      </w:r>
+      <w:r>
+        <w:rPr>
+          <w:b/>
+        </w:rPr>
+        <w:t xml:space="preserve">"BLOCKED pending the dataset decision above. Do not touch"</w:t>
+      </w:r>
+      <w:r>
+        <w:t xml:space="preserve"> because accumulating-versus-curated moves trained-reviewer AC1 between 0.63 and 0.18, either side of the pre-registered 0.61 floor. </w:t>
+      </w:r>
+      <w:r>
+        <w:rPr>
+          <w:b/>
+        </w:rPr>
+        <w:t xml:space="preserve">So the figures now come from the endpoint (single source, cannot be hand-edited in a paragraph), carry `rung2a_locked_on`, are recounted live on every request as `rung2a_live`, and set `rung2a_sample_drift`.</w:t>
+      </w:r>
+      <w:r>
+        <w:t xml:space="preserve"> New guard check </w:t>
+      </w:r>
+      <w:r>
+        <w:rPr>
+          <w:rFonts w:ascii="Consolas" w:hAnsi="Consolas"/>
+        </w:rPr>
+        <w:t xml:space="preserve">check_rung2a_lock</w:t>
+      </w:r>
+      <w:r>
+        <w:t xml:space="preserve"> reads that flag: online it FAILS today with the exact divergence printed, offline it skips so the pre-commit hook is not blocked by a data fact. </w:t>
+      </w:r>
+      <w:r>
+        <w:rPr>
+          <w:b/>
+        </w:rPr>
+        <w:t xml:space="preserve">"62 trained reviewers" does not exist and no key was added for it:</w:t>
+      </w:r>
+      <w:r>
+        <w:t xml:space="preserve"> every occurrence is the decimal half of Gwet's AC1 0.62 / 0.624, and the allowlist entry was already dead, so an endpoint key would have published a fabricated count. Verified: 6 spans live with sentinel data, 6 marked stale on a 503, deployed page carrying all six, guard 15 checks online with the single intended Rung 2a failure, pre-commit 11 checks 0 failed. </w:t>
+      </w:r>
+      <w:r>
+        <w:rPr>
+          <w:b/>
+        </w:rPr>
+        <w:t xml:space="preserve">Decision needed from Phillip: re-run the Rung 2a analysis on the current 113-label set and move all the statistics together, or declare the 108-label set curated with a written inclusion rule. Until then the lock stands and the guard keeps reporting it.</w:t>
       </w:r>
     </w:p>
     <w:sectPr>

</xml_diff>

<commit_message>
Tracker: commercial-language scan of the public site
Co-Authored-By: Claude Opus 5 <noreply@anthropic.com>
</commit_message>
<xml_diff>
--- a/research/MASTER_TRACKER.docx
+++ b/research/MASTER_TRACKER.docx
@@ -40587,6 +40587,126 @@
           <w:b/>
         </w:rPr>
         <w:t xml:space="preserve">Decision needed from Phillip: re-run the Rung 2a analysis on the current 113-label set and move all the statistics together, or declare the 108-label set curated with a written inclusion rule. Until then the lock stands and the guard keeps reporting it.</w:t>
+      </w:r>
+    </w:p>
+    <w:p>
+      <w:pPr>
+        <w:numPr>
+          <w:ilvl w:val="0"/>
+          <w:numId w:val="1"/>
+        </w:numPr>
+        <w:spacing w:after="60"/>
+      </w:pPr>
+      <w:r>
+        <w:t xml:space="preserve">2026-08-15: </w:t>
+      </w:r>
+      <w:r>
+        <w:rPr>
+          <w:b/>
+        </w:rPr>
+        <w:t xml:space="preserve">Phillip asked whether there is commercial language on the website. Scanned rather than recalled; answer is yes for the paid offer and no for any sale signal.</w:t>
+      </w:r>
+      <w:r>
+        <w:t xml:space="preserve"> </w:t>
+      </w:r>
+      <w:r>
+        <w:rPr>
+          <w:b/>
+        </w:rPr>
+        <w:t xml:space="preserve">Paid offer is public and indexable:</w:t>
+      </w:r>
+      <w:r>
+        <w:t xml:space="preserve"> three tiers from </w:t>
+      </w:r>
+      <w:r>
+        <w:rPr>
+          <w:rFonts w:ascii="Consolas" w:hAnsi="Consolas"/>
+        </w:rPr>
+        <w:t xml:space="preserve">api/_offer-config.js</w:t>
+      </w:r>
+      <w:r>
+        <w:t xml:space="preserve"> ($250 AI Documentation Defensibility Review, $500 AI Governance Documentation Review, $750 Benchmark Access and Calibration), each with its own request page, all six commercial pages indexable and in the sitemap. </w:t>
+      </w:r>
+      <w:r>
+        <w:rPr>
+          <w:b/>
+        </w:rPr>
+        <w:t xml:space="preserve">No for-sale or IP-acquisition signal on any public page:</w:t>
+      </w:r>
+      <w:r>
+        <w:t xml:space="preserve"> a word-boundary scan across every HTML file outside the opaque-slug set returned only two hits, both the phrase "Research Data Room" on </w:t>
+      </w:r>
+      <w:r>
+        <w:rPr>
+          <w:rFonts w:ascii="Consolas" w:hAnsi="Consolas"/>
+        </w:rPr>
+        <w:t xml:space="preserve">research-data.html</w:t>
+      </w:r>
+      <w:r>
+        <w:t xml:space="preserve"> and </w:t>
+      </w:r>
+      <w:r>
+        <w:rPr>
+          <w:rFonts w:ascii="Consolas" w:hAnsi="Consolas"/>
+        </w:rPr>
+        <w:t xml:space="preserve">review-status.html</w:t>
+      </w:r>
+      <w:r>
+        <w:t xml:space="preserve">, which is a results page and not an M&amp;A data room, and both carry noindex. The acquisition prospectus and sale dossier sit only on </w:t>
+      </w:r>
+      <w:r>
+        <w:rPr>
+          <w:rFonts w:ascii="Consolas" w:hAnsi="Consolas"/>
+        </w:rPr>
+        <w:t xml:space="preserve">acquisition-9f3c2a7d4b.html</w:t>
+      </w:r>
+      <w:r>
+        <w:t xml:space="preserve">, </w:t>
+      </w:r>
+      <w:r>
+        <w:rPr>
+          <w:rFonts w:ascii="Consolas" w:hAnsi="Consolas"/>
+        </w:rPr>
+        <w:t xml:space="preserve">vp-7c1f9a4e8d2b6035.html</w:t>
+      </w:r>
+      <w:r>
+        <w:t xml:space="preserve"> and </w:t>
+      </w:r>
+      <w:r>
+        <w:rPr>
+          <w:rFonts w:ascii="Consolas" w:hAnsi="Consolas"/>
+        </w:rPr>
+        <w:t xml:space="preserve">programme-status-9872fb93cc94.html</w:t>
+      </w:r>
+      <w:r>
+        <w:t xml:space="preserve">, all noindex. Guardrail 5 holds. </w:t>
+      </w:r>
+      <w:r>
+        <w:rPr>
+          <w:b/>
+        </w:rPr>
+        <w:t xml:space="preserve">Two things worth his attention, both reported not changed: (1) `index.html` links to none of the commercial pages except `check.html`</w:t>
+      </w:r>
+      <w:r>
+        <w:t xml:space="preserve"> — </w:t>
+      </w:r>
+      <w:r>
+        <w:rPr>
+          <w:rFonts w:ascii="Consolas" w:hAnsi="Consolas"/>
+        </w:rPr>
+        <w:t xml:space="preserve">engagement.html</w:t>
+      </w:r>
+      <w:r>
+        <w:t xml:space="preserve"> has 36 inbound links from across the site but not one from the homepage, so the front door does not surface the paid offer at all; </w:t>
+      </w:r>
+      <w:r>
+        <w:rPr>
+          <w:b/>
+        </w:rPr>
+        <w:t xml:space="preserve">(2) `checkout_url` is still empty on all three tiers</w:t>
+      </w:r>
+      <w:r>
+        <w:t xml:space="preserve">, so a reader who reaches a request page cannot pay. Both are owner decisions, not defects.</w:t>
       </w:r>
     </w:p>
     <w:sectPr>

</xml_diff>

<commit_message>
Tracker: engine inventory; /api/review failing in production
Co-Authored-By: Claude Opus 5 <noreply@anthropic.com>
</commit_message>
<xml_diff>
--- a/research/MASTER_TRACKER.docx
+++ b/research/MASTER_TRACKER.docx
@@ -40707,6 +40707,252 @@
       </w:r>
       <w:r>
         <w:t xml:space="preserve">, so a reader who reaches a request page cannot pay. Both are owner decisions, not defects.</w:t>
+      </w:r>
+    </w:p>
+    <w:p>
+      <w:pPr>
+        <w:numPr>
+          <w:ilvl w:val="0"/>
+          <w:numId w:val="1"/>
+        </w:numPr>
+        <w:spacing w:after="60"/>
+      </w:pPr>
+      <w:r>
+        <w:t xml:space="preserve">2026-08-15: </w:t>
+      </w:r>
+      <w:r>
+        <w:rPr>
+          <w:b/>
+        </w:rPr>
+        <w:t xml:space="preserve">Phillip asked whether engines or programs are attached to the paid services. Probed live rather than recalled. Answer: no engine is attached to any of the three tiers, and one engine that does exist is broken in production.</w:t>
+      </w:r>
+      <w:r>
+        <w:t xml:space="preserve"> </w:t>
+      </w:r>
+      <w:r>
+        <w:rPr>
+          <w:b/>
+        </w:rPr>
+        <w:t xml:space="preserve">The three request pages post only to `/api/telemetry`</w:t>
+      </w:r>
+      <w:r>
+        <w:t xml:space="preserve">, an event logger; no endpoint produces the deliverable, so all three services are manual delivery by Phillip with an intake form in front. </w:t>
+      </w:r>
+      <w:r>
+        <w:rPr>
+          <w:b/>
+        </w:rPr>
+        <w:t xml:space="preserve">Engine inventory, probed live:</w:t>
+      </w:r>
+      <w:r>
+        <w:t xml:space="preserve"> </w:t>
+      </w:r>
+      <w:r>
+        <w:rPr>
+          <w:rFonts w:ascii="Consolas" w:hAnsi="Consolas"/>
+        </w:rPr>
+        <w:t xml:space="preserve">api/review.js</w:t>
+      </w:r>
+      <w:r>
+        <w:t xml:space="preserve"> key configured but returning HTTP 500 on 5 of 5 calls; </w:t>
+      </w:r>
+      <w:r>
+        <w:rPr>
+          <w:rFonts w:ascii="Consolas" w:hAnsi="Consolas"/>
+        </w:rPr>
+        <w:t xml:space="preserve">api/review-engine.js</w:t>
+      </w:r>
+      <w:r>
+        <w:t xml:space="preserve"> and </w:t>
+      </w:r>
+      <w:r>
+        <w:rPr>
+          <w:rFonts w:ascii="Consolas" w:hAnsi="Consolas"/>
+        </w:rPr>
+        <w:t xml:space="preserve">api/v1/review-engine.js</w:t>
+      </w:r>
+      <w:r>
+        <w:t xml:space="preserve"> 401, </w:t>
+      </w:r>
+      <w:r>
+        <w:rPr>
+          <w:rFonts w:ascii="Consolas" w:hAnsi="Consolas"/>
+        </w:rPr>
+        <w:t xml:space="preserve">REVIEW_API_TOKEN</w:t>
+      </w:r>
+      <w:r>
+        <w:t xml:space="preserve"> unset; </w:t>
+      </w:r>
+      <w:r>
+        <w:rPr>
+          <w:rFonts w:ascii="Consolas" w:hAnsi="Consolas"/>
+        </w:rPr>
+        <w:t xml:space="preserve">api/bench-score.js</w:t>
+      </w:r>
+      <w:r>
+        <w:t xml:space="preserve"> 503 </w:t>
+      </w:r>
+      <w:r>
+        <w:rPr>
+          <w:rFonts w:ascii="Consolas" w:hAnsi="Consolas"/>
+        </w:rPr>
+        <w:t xml:space="preserve">licensing_not_provisioned</w:t>
+      </w:r>
+      <w:r>
+        <w:t xml:space="preserve">, </w:t>
+      </w:r>
+      <w:r>
+        <w:rPr>
+          <w:rFonts w:ascii="Consolas" w:hAnsi="Consolas"/>
+        </w:rPr>
+        <w:t xml:space="preserve">BENCH_SCORE_TOKENS</w:t>
+      </w:r>
+      <w:r>
+        <w:t xml:space="preserve"> unset, which is the $750 calibration tier's only plausible engine; </w:t>
+      </w:r>
+      <w:r>
+        <w:rPr>
+          <w:rFonts w:ascii="Consolas" w:hAnsi="Consolas"/>
+        </w:rPr>
+        <w:t xml:space="preserve">api/run-study.js</w:t>
+      </w:r>
+      <w:r>
+        <w:t xml:space="preserve"> 401 token-gated as designed (nightly cron); </w:t>
+      </w:r>
+      <w:r>
+        <w:rPr>
+          <w:rFonts w:ascii="Consolas" w:hAnsi="Consolas"/>
+        </w:rPr>
+        <w:t xml:space="preserve">api/checkout.js</w:t>
+      </w:r>
+      <w:r>
+        <w:t xml:space="preserve"> serving the scoping page because </w:t>
+      </w:r>
+      <w:r>
+        <w:rPr>
+          <w:rFonts w:ascii="Consolas" w:hAnsi="Consolas"/>
+        </w:rPr>
+        <w:t xml:space="preserve">checkout_url</w:t>
+      </w:r>
+      <w:r>
+        <w:t xml:space="preserve"> is empty on all three tiers. </w:t>
+      </w:r>
+      <w:r>
+        <w:rPr>
+          <w:b/>
+        </w:rPr>
+        <w:t xml:space="preserve">MATERIAL DEFECT FOUND: `/api/review` fails every call in production</w:t>
+      </w:r>
+      <w:r>
+        <w:t xml:space="preserve"> with </w:t>
+      </w:r>
+      <w:r>
+        <w:rPr>
+          <w:rFonts w:ascii="Consolas" w:hAnsi="Consolas"/>
+        </w:rPr>
+        <w:t xml:space="preserve">Server error: Expected ',' or ']' after array element in JSON at position ~2200-2450</w:t>
+      </w:r>
+      <w:r>
+        <w:t xml:space="preserve">, reproduced 5 of 5 with different inputs and a consistent truncation position. The Anthropic key is present (the request reaches the model and the 'API not configured' branch is not hit), so this is not a credentials problem: the model's JSON is being cut off mid-array and </w:t>
+      </w:r>
+      <w:r>
+        <w:rPr>
+          <w:rFonts w:ascii="Consolas" w:hAnsi="Consolas"/>
+        </w:rPr>
+        <w:t xml:space="preserve">JSON.parse</w:t>
+      </w:r>
+      <w:r>
+        <w:t xml:space="preserve"> at line 168 throws. </w:t>
+      </w:r>
+      <w:r>
+        <w:rPr>
+          <w:b/>
+        </w:rPr>
+        <w:t xml:space="preserve">Most likely cause `max_tokens: 1024` at line 137</w:t>
+      </w:r>
+      <w:r>
+        <w:t xml:space="preserve">, stated as likely rather than confirmed. </w:t>
+      </w:r>
+      <w:r>
+        <w:rPr>
+          <w:b/>
+        </w:rPr>
+        <w:t xml:space="preserve">Affected: the widgets on `index.html` and `training.html`.</w:t>
+      </w:r>
+      <w:r>
+        <w:t xml:space="preserve"> </w:t>
+      </w:r>
+      <w:r>
+        <w:rPr>
+          <w:rFonts w:ascii="Consolas" w:hAnsi="Consolas"/>
+        </w:rPr>
+        <w:t xml:space="preserve">check.html</w:t>
+      </w:r>
+      <w:r>
+        <w:t xml:space="preserve"> is NOT affected: it is a static seven-point checklist with no engine, which is why the free top-of-funnel tool still works. Reported, not fixed, pending his go-ahead. </w:t>
+      </w:r>
+      <w:r>
+        <w:rPr>
+          <w:b/>
+        </w:rPr>
+        <w:t xml:space="preserve">Programs that do work:</w:t>
+      </w:r>
+      <w:r>
+        <w:t xml:space="preserve"> training and certification (</w:t>
+      </w:r>
+      <w:r>
+        <w:rPr>
+          <w:rFonts w:ascii="Consolas" w:hAnsi="Consolas"/>
+        </w:rPr>
+        <w:t xml:space="preserve">enroll</w:t>
+      </w:r>
+      <w:r>
+        <w:t xml:space="preserve">, </w:t>
+      </w:r>
+      <w:r>
+        <w:rPr>
+          <w:rFonts w:ascii="Consolas" w:hAnsi="Consolas"/>
+        </w:rPr>
+        <w:t xml:space="preserve">complete</w:t>
+      </w:r>
+      <w:r>
+        <w:t xml:space="preserve">, </w:t>
+      </w:r>
+      <w:r>
+        <w:rPr>
+          <w:rFonts w:ascii="Consolas" w:hAnsi="Consolas"/>
+        </w:rPr>
+        <w:t xml:space="preserve">reviewer-cert</w:t>
+      </w:r>
+      <w:r>
+        <w:t xml:space="preserve">), the honor and contributor flows (</w:t>
+      </w:r>
+      <w:r>
+        <w:rPr>
+          <w:rFonts w:ascii="Consolas" w:hAnsi="Consolas"/>
+        </w:rPr>
+        <w:t xml:space="preserve">honor</w:t>
+      </w:r>
+      <w:r>
+        <w:t xml:space="preserve">, </w:t>
+      </w:r>
+      <w:r>
+        <w:rPr>
+          <w:rFonts w:ascii="Consolas" w:hAnsi="Consolas"/>
+        </w:rPr>
+        <w:t xml:space="preserve">honor-cert</w:t>
+      </w:r>
+      <w:r>
+        <w:t xml:space="preserve">, </w:t>
+      </w:r>
+      <w:r>
+        <w:rPr>
+          <w:rFonts w:ascii="Consolas" w:hAnsi="Consolas"/>
+        </w:rPr>
+        <w:t xml:space="preserve">contributor</w:t>
+      </w:r>
+      <w:r>
+        <w:t xml:space="preserve">), and the pilots.</w:t>
       </w:r>
     </w:p>
     <w:sectPr>

</xml_diff>

<commit_message>
Remove all commercial language from the 36 evaluator messages
The owner never wanted it there, and the site's commercial offer is
withdrawn while the research runs. A price list inside an award citation
reads as a sales letter to people who did the work unpaid.

- Deleted the three-price block, the "separate, paid arrangement" line and
  the three request-page links. Replaced with a plain statement that
  nothing is being sold and there is nothing to buy.
- Deleted the price reader too: offer_config() and OFFERS are gone, so a
  price cannot come back into these messages by accident.
- Inverted the test rather than removing it. It used to fail when the
  three prices were absent; it now fails when any price, paid-offer phrase
  or request-page slug appears.

36 messages regenerated, 0 commercial tokens left, suite 21/21.

Co-Authored-By: Claude Opus 5 <noreply@anthropic.com>
Claude-Session: https://claude.ai/code/session_01W9UtE7X76spacWeSvBH7tv
</commit_message>
<xml_diff>
--- a/research/MASTER_TRACKER.docx
+++ b/research/MASTER_TRACKER.docx
@@ -41100,6 +41100,99 @@
       </w:r>
       <w:r>
         <w:t xml:space="preserve"> still failing, bench-score still unprovisioned).</w:t>
+      </w:r>
+    </w:p>
+    <w:p>
+      <w:pPr>
+        <w:numPr>
+          <w:ilvl w:val="0"/>
+          <w:numId w:val="1"/>
+        </w:numPr>
+        <w:spacing w:after="60"/>
+      </w:pPr>
+      <w:r>
+        <w:t xml:space="preserve">2026-08-15: </w:t>
+      </w:r>
+      <w:r>
+        <w:rPr>
+          <w:b/>
+        </w:rPr>
+        <w:t xml:space="preserve">All commercial language removed from the 36 evaluator messages, on Phillip's instruction ("I never wanted it in there in the first place").</w:t>
+      </w:r>
+      <w:r>
+        <w:t xml:space="preserve"> Deleted the three-price block, the "separate, paid arrangement" line, the three request-page links and the "worth deciding whether any of that is worth paying for" framing. Replaced with a plain statement that nothing is being sold and there is nothing to buy, plus the free check link. </w:t>
+      </w:r>
+      <w:r>
+        <w:rPr>
+          <w:b/>
+        </w:rPr>
+        <w:t xml:space="preserve">The price reader itself was deleted from the builder, not left loaded:</w:t>
+      </w:r>
+      <w:r>
+        <w:t xml:space="preserve"> </w:t>
+      </w:r>
+      <w:r>
+        <w:rPr>
+          <w:rFonts w:ascii="Consolas" w:hAnsi="Consolas"/>
+        </w:rPr>
+        <w:t xml:space="preserve">offer_config()</w:t>
+      </w:r>
+      <w:r>
+        <w:t xml:space="preserve"> and the </w:t>
+      </w:r>
+      <w:r>
+        <w:rPr>
+          <w:rFonts w:ascii="Consolas" w:hAnsi="Consolas"/>
+        </w:rPr>
+        <w:t xml:space="preserve">OFFERS</w:t>
+      </w:r>
+      <w:r>
+        <w:t xml:space="preserve"> constant are gone, so a price cannot reappear in these messages by accident. </w:t>
+      </w:r>
+      <w:r>
+        <w:rPr>
+          <w:b/>
+        </w:rPr>
+        <w:t xml:space="preserve">The test assertion was inverted rather than deleted:</w:t>
+      </w:r>
+      <w:r>
+        <w:t xml:space="preserve"> it used to fail if the three prices were missing from every message; it now fails if any of </w:t>
+      </w:r>
+      <w:r>
+        <w:rPr>
+          <w:rFonts w:ascii="Consolas" w:hAnsi="Consolas"/>
+        </w:rPr>
+        <w:t xml:space="preserve">$250</w:t>
+      </w:r>
+      <w:r>
+        <w:t xml:space="preserve">, </w:t>
+      </w:r>
+      <w:r>
+        <w:rPr>
+          <w:rFonts w:ascii="Consolas" w:hAnsi="Consolas"/>
+        </w:rPr>
+        <w:t xml:space="preserve">$500</w:t>
+      </w:r>
+      <w:r>
+        <w:t xml:space="preserve">, </w:t>
+      </w:r>
+      <w:r>
+        <w:rPr>
+          <w:rFonts w:ascii="Consolas" w:hAnsi="Consolas"/>
+        </w:rPr>
+        <w:t xml:space="preserve">$750</w:t>
+      </w:r>
+      <w:r>
+        <w:t xml:space="preserve">, "paid arrangement", "worth paying for" or the three request-page slugs appear anywhere. 36 messages regenerated, 0 commercial tokens remaining, suite 21 of 21, drift guard 11 of 11. Not deployed: </w:t>
+      </w:r>
+      <w:r>
+        <w:rPr>
+          <w:rFonts w:ascii="Consolas" w:hAnsi="Consolas"/>
+        </w:rPr>
+        <w:t xml:space="preserve">research/</w:t>
+      </w:r>
+      <w:r>
+        <w:t xml:space="preserve"> never is.</w:t>
       </w:r>
     </w:p>
     <w:sectPr>

</xml_diff>

<commit_message>
Add the /api/review repair report and log it
Co-Authored-By: Claude Opus 5 <noreply@anthropic.com>
Claude-Session: https://claude.ai/code/session_01W9UtE7X76spacWeSvBH7tv
</commit_message>
<xml_diff>
--- a/research/MASTER_TRACKER.docx
+++ b/research/MASTER_TRACKER.docx
@@ -41193,6 +41193,207 @@
       </w:r>
       <w:r>
         <w:t xml:space="preserve"> never is.</w:t>
+      </w:r>
+    </w:p>
+    <w:p>
+      <w:pPr>
+        <w:numPr>
+          <w:ilvl w:val="0"/>
+          <w:numId w:val="1"/>
+        </w:numPr>
+        <w:spacing w:after="60"/>
+      </w:pPr>
+      <w:r>
+        <w:t xml:space="preserve">2026-08-15: </w:t>
+      </w:r>
+      <w:r>
+        <w:rPr>
+          <w:b/>
+        </w:rPr>
+        <w:t xml:space="preserve">`/api/review` repaired, deployed and verified: 21 of 21 production calls pass. Report at `research/API_REVIEW_REPAIR_REPORT.md`.</w:t>
+      </w:r>
+      <w:r>
+        <w:t xml:space="preserve"> </w:t>
+      </w:r>
+      <w:r>
+        <w:rPr>
+          <w:b/>
+        </w:rPr>
+        <w:t xml:space="preserve">Two confirmed root causes, neither inferred from the parser error.</w:t>
+      </w:r>
+      <w:r>
+        <w:t xml:space="preserve"> </w:t>
+      </w:r>
+      <w:r>
+        <w:rPr>
+          <w:b/>
+        </w:rPr>
+        <w:t xml:space="preserve">(1) Truncation.</w:t>
+      </w:r>
+      <w:r>
+        <w:t xml:space="preserve"> </w:t>
+      </w:r>
+      <w:r>
+        <w:rPr>
+          <w:rFonts w:ascii="Consolas" w:hAnsi="Consolas"/>
+        </w:rPr>
+        <w:t xml:space="preserve">max_tokens</w:t>
+      </w:r>
+      <w:r>
+        <w:t xml:space="preserve"> was 1024 and the provider reported </w:t>
+      </w:r>
+      <w:r>
+        <w:rPr>
+          <w:rFonts w:ascii="Consolas" w:hAnsi="Consolas"/>
+        </w:rPr>
+        <w:t xml:space="preserve">stop_reason='max_tokens'</w:t>
+      </w:r>
+      <w:r>
+        <w:t xml:space="preserve"> with </w:t>
+      </w:r>
+      <w:r>
+        <w:rPr>
+          <w:rFonts w:ascii="Consolas" w:hAnsi="Consolas"/>
+        </w:rPr>
+        <w:t xml:space="preserve">output_tokens</w:t>
+      </w:r>
+      <w:r>
+        <w:t xml:space="preserve"> exactly 1024 on 7 of 9 baseline calls. The endpoint never read </w:t>
+      </w:r>
+      <w:r>
+        <w:rPr>
+          <w:rFonts w:ascii="Consolas" w:hAnsi="Consolas"/>
+        </w:rPr>
+        <w:t xml:space="preserve">stop_reason</w:t>
+      </w:r>
+      <w:r>
+        <w:t xml:space="preserve">, so the provider's own account of the failure was being discarded; I deployed structural diagnostics first and the next failure returned it verbatim. </w:t>
+      </w:r>
+      <w:r>
+        <w:rPr>
+          <w:b/>
+        </w:rPr>
+        <w:t xml:space="preserve">(2) A second bug the diagnostics exposed:</w:t>
+      </w:r>
+      <w:r>
+        <w:t xml:space="preserve"> one failure came back </w:t>
+      </w:r>
+      <w:r>
+        <w:rPr>
+          <w:rFonts w:ascii="Consolas" w:hAnsi="Consolas"/>
+        </w:rPr>
+        <w:t xml:space="preserve">stop_reason='end_turn'</w:t>
+      </w:r>
+      <w:r>
+        <w:t xml:space="preserve">, meaning the model had finished normally and the JSON still would not parse. The extractor was </w:t>
+      </w:r>
+      <w:r>
+        <w:rPr>
+          <w:rFonts w:ascii="Consolas" w:hAnsi="Consolas"/>
+        </w:rPr>
+        <w:t xml:space="preserve">/\{[\s\S]*\}/</w:t>
+      </w:r>
+      <w:r>
+        <w:t xml:space="preserve">, greedy from the first brace to the LAST, so a code fence or a sentence after the JSON gets swallowed. Production confirmed both habits in one call: </w:t>
+      </w:r>
+      <w:r>
+        <w:rPr>
+          <w:rFonts w:ascii="Consolas" w:hAnsi="Consolas"/>
+        </w:rPr>
+        <w:t xml:space="preserve">fenced=true</w:t>
+      </w:r>
+      <w:r>
+        <w:t xml:space="preserve"> with 5,317 characters after the last brace. Reproduced deterministically offline, then replaced with a string-aware balanced-brace scan. </w:t>
+      </w:r>
+      <w:r>
+        <w:rPr>
+          <w:b/>
+        </w:rPr>
+        <w:t xml:space="preserve">I got the sizing wrong first and it is recorded rather than quietly corrected:</w:t>
+      </w:r>
+      <w:r>
+        <w:t xml:space="preserve"> I raised the limit to 2048 and wrote in the code that output does not scale with record length. It does. Complete responses ran ~3.1k chars for a 141-char record and ~8.2k for a 1,621-char one, and at the 8,000-char input cap 1 call in 12 still truncated at 2048. Now 4096, sized against the input cap the endpoint accepts rather than a typical record. </w:t>
+      </w:r>
+      <w:r>
+        <w:rPr>
+          <w:b/>
+        </w:rPr>
+        <w:t xml:space="preserve">Two files changed:</w:t>
+      </w:r>
+      <w:r>
+        <w:t xml:space="preserve"> </w:t>
+      </w:r>
+      <w:r>
+        <w:rPr>
+          <w:rFonts w:ascii="Consolas" w:hAnsi="Consolas"/>
+        </w:rPr>
+        <w:t xml:space="preserve">api/review.js</w:t>
+      </w:r>
+      <w:r>
+        <w:t xml:space="preserve"> and a new </w:t>
+      </w:r>
+      <w:r>
+        <w:rPr>
+          <w:rFonts w:ascii="Consolas" w:hAnsi="Consolas"/>
+        </w:rPr>
+        <w:t xml:space="preserve">scripts/test_review_incomplete.mjs</w:t>
+      </w:r>
+      <w:r>
+        <w:t xml:space="preserve"> (8 offline cases against the real handler with the provider stubbed, no key needed). </w:t>
+      </w:r>
+      <w:r>
+        <w:rPr>
+          <w:b/>
+        </w:rPr>
+        <w:t xml:space="preserve">Testing: short 3/3, medium 3/3, long 3/3, at the input cap 12/12, offline safety 8/8, frontend integration both consumers on success and error, drift guard 11 of 11.</w:t>
+      </w:r>
+      <w:r>
+        <w:t xml:space="preserve"> </w:t>
+      </w:r>
+      <w:r>
+        <w:rPr>
+          <w:b/>
+        </w:rPr>
+        <w:t xml:space="preserve">Two of my own tests were wrong before they were right, both recorded in the report:</w:t>
+      </w:r>
+      <w:r>
+        <w:t xml:space="preserve"> a frontend check that read </w:t>
+      </w:r>
+      <w:r>
+        <w:rPr>
+          <w:rFonts w:ascii="Consolas" w:hAnsi="Consolas"/>
+        </w:rPr>
+        <w:t xml:space="preserve">document.body</w:t>
+      </w:r>
+      <w:r>
+        <w:t xml:space="preserve"> and matched the pages' own static copy so an error render looked like a success, and an offline fixture with no closing brace that never reached the parser. Both produced misleading greens and both were corrected before any result was reported. </w:t>
+      </w:r>
+      <w:r>
+        <w:rPr>
+          <w:b/>
+        </w:rPr>
+        <w:t xml:space="preserve">Out of scope and verified untouched:</w:t>
+      </w:r>
+      <w:r>
+        <w:t xml:space="preserve"> bench-score still </w:t>
+      </w:r>
+      <w:r>
+        <w:rPr>
+          <w:rFonts w:ascii="Consolas" w:hAnsi="Consolas"/>
+        </w:rPr>
+        <w:t xml:space="preserve">licensing_not_provisioned</w:t>
+      </w:r>
+      <w:r>
+        <w:t xml:space="preserve"> and unprovisioned; the five commercial pages still unlinked, noindexed and out of the sitemap; the system prompt, the five Review Conditions, the response schema, the model id and every research claim byte-identical. </w:t>
+      </w:r>
+      <w:r>
+        <w:rPr>
+          <w:b/>
+        </w:rPr>
+        <w:t xml:space="preserve">Remaining, neither a defect:</w:t>
+      </w:r>
+      <w:r>
+        <w:t xml:space="preserve"> latency is 8 to 18 seconds per call and always was, and the prompt still does not forbid prose around the JSON, which the new extractor makes harmless.</w:t>
       </w:r>
     </w:p>
     <w:sectPr>

</xml_diff>

<commit_message>
Tracker: plain-language restatement of the detection figure update
Co-Authored-By: Claude Opus 5 <noreply@anthropic.com>
</commit_message>
<xml_diff>
--- a/research/MASTER_TRACKER.docx
+++ b/research/MASTER_TRACKER.docx
@@ -43977,6 +43977,33 @@
       </w:r>
       <w:r>
         <w:t xml:space="preserve"> The per-record judgments are RLS-locked and return empty under the anon key, so 83.9% / 72.7-95.1 / 87.0% / 80.7% are carried from 6 August and unverified at close. The inputs did not change, so they almost certainly have not moved, but a locked figure should not rest on "almost certainly": re-run with a service-role query before submission.</w:t>
+      </w:r>
+    </w:p>
+    <w:p>
+      <w:pPr>
+        <w:numPr>
+          <w:ilvl w:val="0"/>
+          <w:numId w:val="1"/>
+        </w:numPr>
+        <w:spacing w:after="60"/>
+      </w:pPr>
+      <w:r>
+        <w:t xml:space="preserve">2026-08-15: </w:t>
+      </w:r>
+      <w:r>
+        <w:rPr>
+          <w:b/>
+        </w:rPr>
+        <w:t xml:space="preserve">Phillip said the figure-update report was confusing. Re-explained in plain language, no new analysis run and no files changed.</w:t>
+      </w:r>
+      <w:r>
+        <w:t xml:space="preserve"> The four points restated simply: (1) nobody new finished, so the headline panel numbers are the same as the draft; (2) two numbers are out of date and just need swapping, the cross-vendor figure and the reliability label counts; (3) the reliability scare from 2026-08-01 was a mistake in how the check was run, not a problem with his data, because three control-group raters who were not using the five conditions had been included in a reliability check for the five conditions, and removing them reproduces the published figures; (4) one paragraph in the draft claims a limitation the data does not show, and deleting it helps him. One item still open: the accuracy figure needs a service-role re-run before submission. </w:t>
+      </w:r>
+      <w:r>
+        <w:rPr>
+          <w:b/>
+        </w:rPr>
+        <w:t xml:space="preserve">Lesson recorded for my own conduct: the previous turn led with the reconciliation table rather than with the one sentence that mattered, which is that the paper is fine and the block can come off.</w:t>
       </w:r>
     </w:p>
     <w:sectPr>

</xml_diff>